<commit_message>
Power Sequencing is ready for review
</commit_message>
<xml_diff>
--- a/Application_Notes/AN-014_Hardware_Triggering_and_Examples/AN-014 - Hardware Triggering and Examples.docx
+++ b/Application_Notes/AN-014_Hardware_Triggering_and_Examples/AN-014 - Hardware Triggering and Examples.docx
@@ -17,7 +17,7 @@
       <w:bookmarkStart w:id="3" w:name="_Toc465073963"/>
       <w:bookmarkStart w:id="4" w:name="_Toc465168326"/>
       <w:bookmarkStart w:id="5" w:name="_Toc465171757"/>
-      <w:bookmarkStart w:id="6" w:name="_Toc191043699"/>
+      <w:bookmarkStart w:id="6" w:name="_Toc219130200"/>
       <w:r>
         <w:t>Quarch Technology Ltd</w:t>
       </w:r>
@@ -33,7 +33,7 @@
       <w:pPr>
         <w:pStyle w:val="ManualTitle"/>
       </w:pPr>
-      <w:bookmarkStart w:id="7" w:name="_Toc191043700"/>
+      <w:bookmarkStart w:id="7" w:name="_Toc219130201"/>
       <w:r>
         <w:t>Hardware Triggering Application Note</w:t>
       </w:r>
@@ -64,7 +64,7 @@
         <w:pStyle w:val="Heading1"/>
       </w:pPr>
       <w:bookmarkStart w:id="8" w:name="_Toc184889524"/>
-      <w:bookmarkStart w:id="9" w:name="_Toc191043701"/>
+      <w:bookmarkStart w:id="9" w:name="_Toc219130202"/>
       <w:r>
         <w:lastRenderedPageBreak/>
         <w:t xml:space="preserve">1. </w:t>
@@ -82,14 +82,14 @@
         <w:tblLook w:val="04A0" w:firstRow="1" w:lastRow="0" w:firstColumn="1" w:lastColumn="0" w:noHBand="0" w:noVBand="1"/>
       </w:tblPr>
       <w:tblGrid>
-        <w:gridCol w:w="3082"/>
-        <w:gridCol w:w="2967"/>
-        <w:gridCol w:w="2967"/>
+        <w:gridCol w:w="1696"/>
+        <w:gridCol w:w="2410"/>
+        <w:gridCol w:w="4910"/>
       </w:tblGrid>
       <w:tr>
         <w:tc>
           <w:tcPr>
-            <w:tcW w:w="3082" w:type="dxa"/>
+            <w:tcW w:w="1696" w:type="dxa"/>
           </w:tcPr>
           <w:p>
             <w:r>
@@ -99,13 +99,13 @@
         </w:tc>
         <w:tc>
           <w:tcPr>
-            <w:tcW w:w="2967" w:type="dxa"/>
+            <w:tcW w:w="2410" w:type="dxa"/>
           </w:tcPr>
           <w:p/>
         </w:tc>
         <w:tc>
           <w:tcPr>
-            <w:tcW w:w="2967" w:type="dxa"/>
+            <w:tcW w:w="4910" w:type="dxa"/>
           </w:tcPr>
           <w:p>
             <w:r>
@@ -117,21 +117,33 @@
       <w:tr>
         <w:tc>
           <w:tcPr>
-            <w:tcW w:w="3082" w:type="dxa"/>
+            <w:tcW w:w="1696" w:type="dxa"/>
           </w:tcPr>
-          <w:p/>
+          <w:p>
+            <w:r>
+              <w:t>1.1</w:t>
+            </w:r>
+          </w:p>
         </w:tc>
         <w:tc>
           <w:tcPr>
-            <w:tcW w:w="2967" w:type="dxa"/>
+            <w:tcW w:w="2410" w:type="dxa"/>
           </w:tcPr>
-          <w:p/>
+          <w:p>
+            <w:r>
+              <w:t>12/01/2026</w:t>
+            </w:r>
+          </w:p>
         </w:tc>
         <w:tc>
           <w:tcPr>
-            <w:tcW w:w="2967" w:type="dxa"/>
+            <w:tcW w:w="4910" w:type="dxa"/>
           </w:tcPr>
-          <w:p/>
+          <w:p>
+            <w:r>
+              <w:t>Added 5.2 (Power Sequencing)</w:t>
+            </w:r>
+          </w:p>
         </w:tc>
       </w:tr>
     </w:tbl>
@@ -213,7 +225,7 @@
           <w:r>
             <w:fldChar w:fldCharType="separate"/>
           </w:r>
-          <w:hyperlink w:anchor="_Toc191043699" w:history="1">
+          <w:hyperlink w:anchor="_Toc219130200" w:history="1">
             <w:r>
               <w:rPr>
                 <w:rStyle w:val="Hyperlink"/>
@@ -240,7 +252,7 @@
                 <w:noProof/>
                 <w:webHidden/>
               </w:rPr>
-              <w:instrText xml:space="preserve"> PAGEREF _Toc191043699 \h </w:instrText>
+              <w:instrText xml:space="preserve"> PAGEREF _Toc219130200 \h </w:instrText>
             </w:r>
             <w:r>
               <w:rPr>
@@ -283,7 +295,7 @@
               <w14:ligatures w14:val="standardContextual"/>
             </w:rPr>
           </w:pPr>
-          <w:hyperlink w:anchor="_Toc191043700" w:history="1">
+          <w:hyperlink w:anchor="_Toc219130201" w:history="1">
             <w:r>
               <w:rPr>
                 <w:rStyle w:val="Hyperlink"/>
@@ -310,7 +322,7 @@
                 <w:noProof/>
                 <w:webHidden/>
               </w:rPr>
-              <w:instrText xml:space="preserve"> PAGEREF _Toc191043700 \h </w:instrText>
+              <w:instrText xml:space="preserve"> PAGEREF _Toc219130201 \h </w:instrText>
             </w:r>
             <w:r>
               <w:rPr>
@@ -353,7 +365,7 @@
               <w14:ligatures w14:val="standardContextual"/>
             </w:rPr>
           </w:pPr>
-          <w:hyperlink w:anchor="_Toc191043701" w:history="1">
+          <w:hyperlink w:anchor="_Toc219130202" w:history="1">
             <w:r>
               <w:rPr>
                 <w:rStyle w:val="Hyperlink"/>
@@ -380,7 +392,7 @@
                 <w:noProof/>
                 <w:webHidden/>
               </w:rPr>
-              <w:instrText xml:space="preserve"> PAGEREF _Toc191043701 \h </w:instrText>
+              <w:instrText xml:space="preserve"> PAGEREF _Toc219130202 \h </w:instrText>
             </w:r>
             <w:r>
               <w:rPr>
@@ -423,7 +435,7 @@
               <w14:ligatures w14:val="standardContextual"/>
             </w:rPr>
           </w:pPr>
-          <w:hyperlink w:anchor="_Toc191043702" w:history="1">
+          <w:hyperlink w:anchor="_Toc219130203" w:history="1">
             <w:r>
               <w:rPr>
                 <w:rStyle w:val="Hyperlink"/>
@@ -450,7 +462,7 @@
                 <w:noProof/>
                 <w:webHidden/>
               </w:rPr>
-              <w:instrText xml:space="preserve"> PAGEREF _Toc191043702 \h </w:instrText>
+              <w:instrText xml:space="preserve"> PAGEREF _Toc219130203 \h </w:instrText>
             </w:r>
             <w:r>
               <w:rPr>
@@ -493,7 +505,7 @@
               <w14:ligatures w14:val="standardContextual"/>
             </w:rPr>
           </w:pPr>
-          <w:hyperlink w:anchor="_Toc191043703" w:history="1">
+          <w:hyperlink w:anchor="_Toc219130204" w:history="1">
             <w:r>
               <w:rPr>
                 <w:rStyle w:val="Hyperlink"/>
@@ -520,7 +532,7 @@
                 <w:noProof/>
                 <w:webHidden/>
               </w:rPr>
-              <w:instrText xml:space="preserve"> PAGEREF _Toc191043703 \h </w:instrText>
+              <w:instrText xml:space="preserve"> PAGEREF _Toc219130204 \h </w:instrText>
             </w:r>
             <w:r>
               <w:rPr>
@@ -562,7 +574,7 @@
               <w14:ligatures w14:val="standardContextual"/>
             </w:rPr>
           </w:pPr>
-          <w:hyperlink w:anchor="_Toc191043704" w:history="1">
+          <w:hyperlink w:anchor="_Toc219130205" w:history="1">
             <w:r>
               <w:rPr>
                 <w:rStyle w:val="Hyperlink"/>
@@ -589,7 +601,7 @@
                 <w:noProof/>
                 <w:webHidden/>
               </w:rPr>
-              <w:instrText xml:space="preserve"> PAGEREF _Toc191043704 \h </w:instrText>
+              <w:instrText xml:space="preserve"> PAGEREF _Toc219130205 \h </w:instrText>
             </w:r>
             <w:r>
               <w:rPr>
@@ -632,7 +644,7 @@
               <w:lang w:eastAsia="en-GB"/>
             </w:rPr>
           </w:pPr>
-          <w:hyperlink w:anchor="_Toc191043705" w:history="1">
+          <w:hyperlink w:anchor="_Toc219130206" w:history="1">
             <w:r>
               <w:rPr>
                 <w:rStyle w:val="Hyperlink"/>
@@ -659,7 +671,7 @@
                 <w:noProof/>
                 <w:webHidden/>
               </w:rPr>
-              <w:instrText xml:space="preserve"> PAGEREF _Toc191043705 \h </w:instrText>
+              <w:instrText xml:space="preserve"> PAGEREF _Toc219130206 \h </w:instrText>
             </w:r>
             <w:r>
               <w:rPr>
@@ -692,22 +704,23 @@
         </w:p>
         <w:p>
           <w:pPr>
-            <w:pStyle w:val="TOC2"/>
+            <w:pStyle w:val="TOC3"/>
+            <w:tabs>
+              <w:tab w:val="right" w:leader="dot" w:pos="9016"/>
+            </w:tabs>
             <w:rPr>
-              <w:rFonts w:asciiTheme="minorHAnsi" w:hAnsiTheme="minorHAnsi" w:cstheme="minorBidi"/>
+              <w:rFonts w:eastAsiaTheme="minorEastAsia"/>
               <w:noProof/>
-              <w:kern w:val="2"/>
-              <w:lang w:val="en-GB" w:eastAsia="en-GB" w:bidi="ar-SA"/>
-              <w14:ligatures w14:val="standardContextual"/>
+              <w:lang w:eastAsia="en-GB"/>
             </w:rPr>
           </w:pPr>
-          <w:hyperlink w:anchor="_Toc191043706" w:history="1">
+          <w:hyperlink w:anchor="_Toc219130207" w:history="1">
             <w:r>
               <w:rPr>
                 <w:rStyle w:val="Hyperlink"/>
                 <w:noProof/>
               </w:rPr>
-              <w:t>6. Power Applications</w:t>
+              <w:t>5.2 Power Sequencing – PCIe CEM Specification</w:t>
             </w:r>
             <w:r>
               <w:rPr>
@@ -728,7 +741,7 @@
                 <w:noProof/>
                 <w:webHidden/>
               </w:rPr>
-              <w:instrText xml:space="preserve"> PAGEREF _Toc191043706 \h </w:instrText>
+              <w:instrText xml:space="preserve"> PAGEREF _Toc219130207 \h </w:instrText>
             </w:r>
             <w:r>
               <w:rPr>
@@ -761,6 +774,75 @@
         </w:p>
         <w:p>
           <w:pPr>
+            <w:pStyle w:val="TOC2"/>
+            <w:rPr>
+              <w:rFonts w:asciiTheme="minorHAnsi" w:hAnsiTheme="minorHAnsi" w:cstheme="minorBidi"/>
+              <w:noProof/>
+              <w:kern w:val="2"/>
+              <w:lang w:val="en-GB" w:eastAsia="en-GB" w:bidi="ar-SA"/>
+              <w14:ligatures w14:val="standardContextual"/>
+            </w:rPr>
+          </w:pPr>
+          <w:hyperlink w:anchor="_Toc219130208" w:history="1">
+            <w:r>
+              <w:rPr>
+                <w:rStyle w:val="Hyperlink"/>
+                <w:noProof/>
+              </w:rPr>
+              <w:t>6. Power Applications</w:t>
+            </w:r>
+            <w:r>
+              <w:rPr>
+                <w:noProof/>
+                <w:webHidden/>
+              </w:rPr>
+              <w:tab/>
+            </w:r>
+            <w:r>
+              <w:rPr>
+                <w:noProof/>
+                <w:webHidden/>
+              </w:rPr>
+              <w:fldChar w:fldCharType="begin"/>
+            </w:r>
+            <w:r>
+              <w:rPr>
+                <w:noProof/>
+                <w:webHidden/>
+              </w:rPr>
+              <w:instrText xml:space="preserve"> PAGEREF _Toc219130208 \h </w:instrText>
+            </w:r>
+            <w:r>
+              <w:rPr>
+                <w:noProof/>
+                <w:webHidden/>
+              </w:rPr>
+            </w:r>
+            <w:r>
+              <w:rPr>
+                <w:noProof/>
+                <w:webHidden/>
+              </w:rPr>
+              <w:fldChar w:fldCharType="separate"/>
+            </w:r>
+            <w:r>
+              <w:rPr>
+                <w:noProof/>
+                <w:webHidden/>
+              </w:rPr>
+              <w:t>14</w:t>
+            </w:r>
+            <w:r>
+              <w:rPr>
+                <w:noProof/>
+                <w:webHidden/>
+              </w:rPr>
+              <w:fldChar w:fldCharType="end"/>
+            </w:r>
+          </w:hyperlink>
+        </w:p>
+        <w:p>
+          <w:pPr>
             <w:pStyle w:val="TOC3"/>
             <w:tabs>
               <w:tab w:val="right" w:leader="dot" w:pos="9016"/>
@@ -771,7 +853,7 @@
               <w:lang w:eastAsia="en-GB"/>
             </w:rPr>
           </w:pPr>
-          <w:hyperlink w:anchor="_Toc191043707" w:history="1">
+          <w:hyperlink w:anchor="_Toc219130209" w:history="1">
             <w:r>
               <w:rPr>
                 <w:rStyle w:val="Hyperlink"/>
@@ -798,7 +880,7 @@
                 <w:noProof/>
                 <w:webHidden/>
               </w:rPr>
-              <w:instrText xml:space="preserve"> PAGEREF _Toc191043707 \h </w:instrText>
+              <w:instrText xml:space="preserve"> PAGEREF _Toc219130209 \h </w:instrText>
             </w:r>
             <w:r>
               <w:rPr>
@@ -818,7 +900,7 @@
                 <w:noProof/>
                 <w:webHidden/>
               </w:rPr>
-              <w:t>11</w:t>
+              <w:t>14</w:t>
             </w:r>
             <w:r>
               <w:rPr>
@@ -841,7 +923,7 @@
               <w:lang w:eastAsia="en-GB"/>
             </w:rPr>
           </w:pPr>
-          <w:hyperlink w:anchor="_Toc191043708" w:history="1">
+          <w:hyperlink w:anchor="_Toc219130210" w:history="1">
             <w:r>
               <w:rPr>
                 <w:rStyle w:val="Hyperlink"/>
@@ -868,7 +950,7 @@
                 <w:noProof/>
                 <w:webHidden/>
               </w:rPr>
-              <w:instrText xml:space="preserve"> PAGEREF _Toc191043708 \h </w:instrText>
+              <w:instrText xml:space="preserve"> PAGEREF _Toc219130210 \h </w:instrText>
             </w:r>
             <w:r>
               <w:rPr>
@@ -888,7 +970,7 @@
                 <w:noProof/>
                 <w:webHidden/>
               </w:rPr>
-              <w:t>15</w:t>
+              <w:t>18</w:t>
             </w:r>
             <w:r>
               <w:rPr>
@@ -911,7 +993,7 @@
               <w:lang w:eastAsia="en-GB"/>
             </w:rPr>
           </w:pPr>
-          <w:hyperlink w:anchor="_Toc191043709" w:history="1">
+          <w:hyperlink w:anchor="_Toc219130211" w:history="1">
             <w:r>
               <w:rPr>
                 <w:rStyle w:val="Hyperlink"/>
@@ -938,77 +1020,7 @@
                 <w:noProof/>
                 <w:webHidden/>
               </w:rPr>
-              <w:instrText xml:space="preserve"> PAGEREF _Toc191043709 \h </w:instrText>
-            </w:r>
-            <w:r>
-              <w:rPr>
-                <w:noProof/>
-                <w:webHidden/>
-              </w:rPr>
-            </w:r>
-            <w:r>
-              <w:rPr>
-                <w:noProof/>
-                <w:webHidden/>
-              </w:rPr>
-              <w:fldChar w:fldCharType="separate"/>
-            </w:r>
-            <w:r>
-              <w:rPr>
-                <w:noProof/>
-                <w:webHidden/>
-              </w:rPr>
-              <w:t>16</w:t>
-            </w:r>
-            <w:r>
-              <w:rPr>
-                <w:noProof/>
-                <w:webHidden/>
-              </w:rPr>
-              <w:fldChar w:fldCharType="end"/>
-            </w:r>
-          </w:hyperlink>
-        </w:p>
-        <w:p>
-          <w:pPr>
-            <w:pStyle w:val="TOC1"/>
-            <w:rPr>
-              <w:rFonts w:asciiTheme="minorHAnsi" w:hAnsiTheme="minorHAnsi" w:cstheme="minorBidi"/>
-              <w:b w:val="0"/>
-              <w:noProof/>
-              <w:kern w:val="2"/>
-              <w:lang w:val="en-GB" w:eastAsia="en-GB" w:bidi="ar-SA"/>
-              <w14:ligatures w14:val="standardContextual"/>
-            </w:rPr>
-          </w:pPr>
-          <w:hyperlink w:anchor="_Toc191043710" w:history="1">
-            <w:r>
-              <w:rPr>
-                <w:rStyle w:val="Hyperlink"/>
-                <w:noProof/>
-              </w:rPr>
-              <w:t>7. General Trigger Commands</w:t>
-            </w:r>
-            <w:r>
-              <w:rPr>
-                <w:noProof/>
-                <w:webHidden/>
-              </w:rPr>
-              <w:tab/>
-            </w:r>
-            <w:r>
-              <w:rPr>
-                <w:noProof/>
-                <w:webHidden/>
-              </w:rPr>
-              <w:fldChar w:fldCharType="begin"/>
-            </w:r>
-            <w:r>
-              <w:rPr>
-                <w:noProof/>
-                <w:webHidden/>
-              </w:rPr>
-              <w:instrText xml:space="preserve"> PAGEREF _Toc191043710 \h </w:instrText>
+              <w:instrText xml:space="preserve"> PAGEREF _Toc219130211 \h </w:instrText>
             </w:r>
             <w:r>
               <w:rPr>
@@ -1040,6 +1052,76 @@
           </w:hyperlink>
         </w:p>
         <w:p>
+          <w:pPr>
+            <w:pStyle w:val="TOC1"/>
+            <w:rPr>
+              <w:rFonts w:asciiTheme="minorHAnsi" w:hAnsiTheme="minorHAnsi" w:cstheme="minorBidi"/>
+              <w:b w:val="0"/>
+              <w:noProof/>
+              <w:kern w:val="2"/>
+              <w:lang w:val="en-GB" w:eastAsia="en-GB" w:bidi="ar-SA"/>
+              <w14:ligatures w14:val="standardContextual"/>
+            </w:rPr>
+          </w:pPr>
+          <w:hyperlink w:anchor="_Toc219130212" w:history="1">
+            <w:r>
+              <w:rPr>
+                <w:rStyle w:val="Hyperlink"/>
+                <w:noProof/>
+              </w:rPr>
+              <w:t>7. General Trigger Commands</w:t>
+            </w:r>
+            <w:r>
+              <w:rPr>
+                <w:noProof/>
+                <w:webHidden/>
+              </w:rPr>
+              <w:tab/>
+            </w:r>
+            <w:r>
+              <w:rPr>
+                <w:noProof/>
+                <w:webHidden/>
+              </w:rPr>
+              <w:fldChar w:fldCharType="begin"/>
+            </w:r>
+            <w:r>
+              <w:rPr>
+                <w:noProof/>
+                <w:webHidden/>
+              </w:rPr>
+              <w:instrText xml:space="preserve"> PAGEREF _Toc219130212 \h </w:instrText>
+            </w:r>
+            <w:r>
+              <w:rPr>
+                <w:noProof/>
+                <w:webHidden/>
+              </w:rPr>
+            </w:r>
+            <w:r>
+              <w:rPr>
+                <w:noProof/>
+                <w:webHidden/>
+              </w:rPr>
+              <w:fldChar w:fldCharType="separate"/>
+            </w:r>
+            <w:r>
+              <w:rPr>
+                <w:noProof/>
+                <w:webHidden/>
+              </w:rPr>
+              <w:t>22</w:t>
+            </w:r>
+            <w:r>
+              <w:rPr>
+                <w:noProof/>
+                <w:webHidden/>
+              </w:rPr>
+              <w:fldChar w:fldCharType="end"/>
+            </w:r>
+          </w:hyperlink>
+        </w:p>
+        <w:p>
           <w:r>
             <w:rPr>
               <w:b/>
@@ -1067,7 +1149,7 @@
         <w:pStyle w:val="Heading1"/>
       </w:pPr>
       <w:bookmarkStart w:id="10" w:name="_Toc184889526"/>
-      <w:bookmarkStart w:id="11" w:name="_Toc191043702"/>
+      <w:bookmarkStart w:id="11" w:name="_Toc219130203"/>
       <w:r>
         <w:lastRenderedPageBreak/>
         <w:t xml:space="preserve">3. </w:t>
@@ -1099,7 +1181,7 @@
       <w:r>
         <w:fldChar w:fldCharType="separate"/>
       </w:r>
-      <w:hyperlink w:anchor="_Toc191043684" w:history="1">
+      <w:hyperlink w:anchor="_Toc219130216" w:history="1">
         <w:r>
           <w:rPr>
             <w:rStyle w:val="Hyperlink"/>
@@ -1128,7 +1210,7 @@
             <w:noProof/>
             <w:webHidden/>
           </w:rPr>
-          <w:instrText xml:space="preserve"> PAGEREF _Toc191043684 \h </w:instrText>
+          <w:instrText xml:space="preserve"> PAGEREF _Toc219130216 \h </w:instrText>
         </w:r>
         <w:r>
           <w:rPr>
@@ -1171,7 +1253,7 @@
           <w:lang w:eastAsia="en-GB"/>
         </w:rPr>
       </w:pPr>
-      <w:hyperlink w:anchor="_Toc191043685" w:history="1">
+      <w:hyperlink w:anchor="_Toc219130217" w:history="1">
         <w:r>
           <w:rPr>
             <w:rStyle w:val="Hyperlink"/>
@@ -1200,7 +1282,7 @@
             <w:noProof/>
             <w:webHidden/>
           </w:rPr>
-          <w:instrText xml:space="preserve"> PAGEREF _Toc191043685 \h </w:instrText>
+          <w:instrText xml:space="preserve"> PAGEREF _Toc219130217 \h </w:instrText>
         </w:r>
         <w:r>
           <w:rPr>
@@ -1243,7 +1325,7 @@
           <w:lang w:eastAsia="en-GB"/>
         </w:rPr>
       </w:pPr>
-      <w:hyperlink w:anchor="_Toc191043686" w:history="1">
+      <w:hyperlink w:anchor="_Toc219130218" w:history="1">
         <w:r>
           <w:rPr>
             <w:rStyle w:val="Hyperlink"/>
@@ -1272,7 +1354,7 @@
             <w:noProof/>
             <w:webHidden/>
           </w:rPr>
-          <w:instrText xml:space="preserve"> PAGEREF _Toc191043686 \h </w:instrText>
+          <w:instrText xml:space="preserve"> PAGEREF _Toc219130218 \h </w:instrText>
         </w:r>
         <w:r>
           <w:rPr>
@@ -1315,7 +1397,7 @@
           <w:lang w:eastAsia="en-GB"/>
         </w:rPr>
       </w:pPr>
-      <w:hyperlink w:anchor="_Toc191043687" w:history="1">
+      <w:hyperlink w:anchor="_Toc219130219" w:history="1">
         <w:r>
           <w:rPr>
             <w:rStyle w:val="Hyperlink"/>
@@ -1344,7 +1426,7 @@
             <w:noProof/>
             <w:webHidden/>
           </w:rPr>
-          <w:instrText xml:space="preserve"> PAGEREF _Toc191043687 \h </w:instrText>
+          <w:instrText xml:space="preserve"> PAGEREF _Toc219130219 \h </w:instrText>
         </w:r>
         <w:r>
           <w:rPr>
@@ -1387,7 +1469,7 @@
           <w:lang w:eastAsia="en-GB"/>
         </w:rPr>
       </w:pPr>
-      <w:hyperlink w:anchor="_Toc191043688" w:history="1">
+      <w:hyperlink w:anchor="_Toc219130220" w:history="1">
         <w:r>
           <w:rPr>
             <w:rStyle w:val="Hyperlink"/>
@@ -1416,7 +1498,7 @@
             <w:noProof/>
             <w:webHidden/>
           </w:rPr>
-          <w:instrText xml:space="preserve"> PAGEREF _Toc191043688 \h </w:instrText>
+          <w:instrText xml:space="preserve"> PAGEREF _Toc219130220 \h </w:instrText>
         </w:r>
         <w:r>
           <w:rPr>
@@ -1459,7 +1541,7 @@
           <w:lang w:eastAsia="en-GB"/>
         </w:rPr>
       </w:pPr>
-      <w:hyperlink w:anchor="_Toc191043689" w:history="1">
+      <w:hyperlink w:anchor="_Toc219130221" w:history="1">
         <w:r>
           <w:rPr>
             <w:rStyle w:val="Hyperlink"/>
@@ -1488,7 +1570,7 @@
             <w:noProof/>
             <w:webHidden/>
           </w:rPr>
-          <w:instrText xml:space="preserve"> PAGEREF _Toc191043689 \h </w:instrText>
+          <w:instrText xml:space="preserve"> PAGEREF _Toc219130221 \h </w:instrText>
         </w:r>
         <w:r>
           <w:rPr>
@@ -1531,7 +1613,7 @@
           <w:lang w:eastAsia="en-GB"/>
         </w:rPr>
       </w:pPr>
-      <w:hyperlink w:anchor="_Toc191043690" w:history="1">
+      <w:hyperlink w:anchor="_Toc219130222" w:history="1">
         <w:r>
           <w:rPr>
             <w:rStyle w:val="Hyperlink"/>
@@ -1560,7 +1642,7 @@
             <w:noProof/>
             <w:webHidden/>
           </w:rPr>
-          <w:instrText xml:space="preserve"> PAGEREF _Toc191043690 \h </w:instrText>
+          <w:instrText xml:space="preserve"> PAGEREF _Toc219130222 \h </w:instrText>
         </w:r>
         <w:r>
           <w:rPr>
@@ -1603,7 +1685,223 @@
           <w:lang w:eastAsia="en-GB"/>
         </w:rPr>
       </w:pPr>
-      <w:hyperlink w:anchor="_Toc191043691" w:history="1">
+      <w:hyperlink w:anchor="_Toc219130223" w:history="1">
+        <w:r>
+          <w:rPr>
+            <w:rStyle w:val="Hyperlink"/>
+            <w:b/>
+            <w:bCs/>
+            <w:noProof/>
+          </w:rPr>
+          <w:t>Figure 8 - Power Sequencing Set-up</w:t>
+        </w:r>
+        <w:r>
+          <w:rPr>
+            <w:noProof/>
+            <w:webHidden/>
+          </w:rPr>
+          <w:tab/>
+        </w:r>
+        <w:r>
+          <w:rPr>
+            <w:noProof/>
+            <w:webHidden/>
+          </w:rPr>
+          <w:fldChar w:fldCharType="begin"/>
+        </w:r>
+        <w:r>
+          <w:rPr>
+            <w:noProof/>
+            <w:webHidden/>
+          </w:rPr>
+          <w:instrText xml:space="preserve"> PAGEREF _Toc219130223 \h </w:instrText>
+        </w:r>
+        <w:r>
+          <w:rPr>
+            <w:noProof/>
+            <w:webHidden/>
+          </w:rPr>
+        </w:r>
+        <w:r>
+          <w:rPr>
+            <w:noProof/>
+            <w:webHidden/>
+          </w:rPr>
+          <w:fldChar w:fldCharType="separate"/>
+        </w:r>
+        <w:r>
+          <w:rPr>
+            <w:noProof/>
+            <w:webHidden/>
+          </w:rPr>
+          <w:t>11</w:t>
+        </w:r>
+        <w:r>
+          <w:rPr>
+            <w:noProof/>
+            <w:webHidden/>
+          </w:rPr>
+          <w:fldChar w:fldCharType="end"/>
+        </w:r>
+      </w:hyperlink>
+    </w:p>
+    <w:p>
+      <w:pPr>
+        <w:pStyle w:val="TableofFigures"/>
+        <w:tabs>
+          <w:tab w:val="right" w:leader="dot" w:pos="9016"/>
+        </w:tabs>
+        <w:rPr>
+          <w:rFonts w:eastAsiaTheme="minorEastAsia"/>
+          <w:noProof/>
+          <w:lang w:eastAsia="en-GB"/>
+        </w:rPr>
+      </w:pPr>
+      <w:hyperlink w:anchor="_Toc219130224" w:history="1">
+        <w:r>
+          <w:rPr>
+            <w:rStyle w:val="Hyperlink"/>
+            <w:b/>
+            <w:bCs/>
+            <w:noProof/>
+          </w:rPr>
+          <w:t>Figure 9 - Setup</w:t>
+        </w:r>
+        <w:r>
+          <w:rPr>
+            <w:noProof/>
+            <w:webHidden/>
+          </w:rPr>
+          <w:tab/>
+        </w:r>
+        <w:r>
+          <w:rPr>
+            <w:noProof/>
+            <w:webHidden/>
+          </w:rPr>
+          <w:fldChar w:fldCharType="begin"/>
+        </w:r>
+        <w:r>
+          <w:rPr>
+            <w:noProof/>
+            <w:webHidden/>
+          </w:rPr>
+          <w:instrText xml:space="preserve"> PAGEREF _Toc219130224 \h </w:instrText>
+        </w:r>
+        <w:r>
+          <w:rPr>
+            <w:noProof/>
+            <w:webHidden/>
+          </w:rPr>
+        </w:r>
+        <w:r>
+          <w:rPr>
+            <w:noProof/>
+            <w:webHidden/>
+          </w:rPr>
+          <w:fldChar w:fldCharType="separate"/>
+        </w:r>
+        <w:r>
+          <w:rPr>
+            <w:noProof/>
+            <w:webHidden/>
+          </w:rPr>
+          <w:t>12</w:t>
+        </w:r>
+        <w:r>
+          <w:rPr>
+            <w:noProof/>
+            <w:webHidden/>
+          </w:rPr>
+          <w:fldChar w:fldCharType="end"/>
+        </w:r>
+      </w:hyperlink>
+    </w:p>
+    <w:p>
+      <w:pPr>
+        <w:pStyle w:val="TableofFigures"/>
+        <w:tabs>
+          <w:tab w:val="right" w:leader="dot" w:pos="9016"/>
+        </w:tabs>
+        <w:rPr>
+          <w:rFonts w:eastAsiaTheme="minorEastAsia"/>
+          <w:noProof/>
+          <w:lang w:eastAsia="en-GB"/>
+        </w:rPr>
+      </w:pPr>
+      <w:hyperlink w:anchor="_Toc219130225" w:history="1">
+        <w:r>
+          <w:rPr>
+            <w:rStyle w:val="Hyperlink"/>
+            <w:b/>
+            <w:bCs/>
+            <w:noProof/>
+          </w:rPr>
+          <w:t>Figure 10 - QPS Trace of Power Sequencing – Power Up</w:t>
+        </w:r>
+        <w:r>
+          <w:rPr>
+            <w:noProof/>
+            <w:webHidden/>
+          </w:rPr>
+          <w:tab/>
+        </w:r>
+        <w:r>
+          <w:rPr>
+            <w:noProof/>
+            <w:webHidden/>
+          </w:rPr>
+          <w:fldChar w:fldCharType="begin"/>
+        </w:r>
+        <w:r>
+          <w:rPr>
+            <w:noProof/>
+            <w:webHidden/>
+          </w:rPr>
+          <w:instrText xml:space="preserve"> PAGEREF _Toc219130225 \h </w:instrText>
+        </w:r>
+        <w:r>
+          <w:rPr>
+            <w:noProof/>
+            <w:webHidden/>
+          </w:rPr>
+        </w:r>
+        <w:r>
+          <w:rPr>
+            <w:noProof/>
+            <w:webHidden/>
+          </w:rPr>
+          <w:fldChar w:fldCharType="separate"/>
+        </w:r>
+        <w:r>
+          <w:rPr>
+            <w:noProof/>
+            <w:webHidden/>
+          </w:rPr>
+          <w:t>13</w:t>
+        </w:r>
+        <w:r>
+          <w:rPr>
+            <w:noProof/>
+            <w:webHidden/>
+          </w:rPr>
+          <w:fldChar w:fldCharType="end"/>
+        </w:r>
+      </w:hyperlink>
+    </w:p>
+    <w:p>
+      <w:pPr>
+        <w:pStyle w:val="TableofFigures"/>
+        <w:tabs>
+          <w:tab w:val="right" w:leader="dot" w:pos="9016"/>
+        </w:tabs>
+        <w:rPr>
+          <w:rFonts w:eastAsiaTheme="minorEastAsia"/>
+          <w:noProof/>
+          <w:lang w:eastAsia="en-GB"/>
+        </w:rPr>
+      </w:pPr>
+      <w:hyperlink w:anchor="_Toc219130226" w:history="1">
         <w:r>
           <w:rPr>
             <w:rStyle w:val="Hyperlink"/>
@@ -1612,7 +1910,7 @@
             <w:bCs/>
             <w:noProof/>
           </w:rPr>
-          <w:t>Figure 8. Setup with U.2 Breaker + Power Injection Fixture</w:t>
+          <w:t>Figure 11. Setup with U.2 Breaker + Power Injection Fixture</w:t>
         </w:r>
         <w:r>
           <w:rPr>
@@ -1633,7 +1931,7 @@
             <w:noProof/>
             <w:webHidden/>
           </w:rPr>
-          <w:instrText xml:space="preserve"> PAGEREF _Toc191043691 \h </w:instrText>
+          <w:instrText xml:space="preserve"> PAGEREF _Toc219130226 \h </w:instrText>
         </w:r>
         <w:r>
           <w:rPr>
@@ -1653,7 +1951,7 @@
             <w:noProof/>
             <w:webHidden/>
           </w:rPr>
-          <w:t>11</w:t>
+          <w:t>14</w:t>
         </w:r>
         <w:r>
           <w:rPr>
@@ -1676,7 +1974,7 @@
           <w:lang w:eastAsia="en-GB"/>
         </w:rPr>
       </w:pPr>
-      <w:hyperlink w:anchor="_Toc191043692" w:history="1">
+      <w:hyperlink w:anchor="_Toc219130227" w:history="1">
         <w:r>
           <w:rPr>
             <w:rStyle w:val="Hyperlink"/>
@@ -1685,7 +1983,7 @@
             <w:bCs/>
             <w:noProof/>
           </w:rPr>
-          <w:t>Figure 9. Flow Chart of a Setup</w:t>
+          <w:t>Figure 12. Flow Chart of a Setup</w:t>
         </w:r>
         <w:r>
           <w:rPr>
@@ -1706,7 +2004,7 @@
             <w:noProof/>
             <w:webHidden/>
           </w:rPr>
-          <w:instrText xml:space="preserve"> PAGEREF _Toc191043692 \h </w:instrText>
+          <w:instrText xml:space="preserve"> PAGEREF _Toc219130227 \h </w:instrText>
         </w:r>
         <w:r>
           <w:rPr>
@@ -1726,7 +2024,7 @@
             <w:noProof/>
             <w:webHidden/>
           </w:rPr>
-          <w:t>12</w:t>
+          <w:t>15</w:t>
         </w:r>
         <w:r>
           <w:rPr>
@@ -1749,7 +2047,7 @@
           <w:lang w:eastAsia="en-GB"/>
         </w:rPr>
       </w:pPr>
-      <w:hyperlink w:anchor="_Toc191043693" w:history="1">
+      <w:hyperlink w:anchor="_Toc219130228" w:history="1">
         <w:r>
           <w:rPr>
             <w:rStyle w:val="Hyperlink"/>
@@ -1758,7 +2056,7 @@
             <w:bCs/>
             <w:noProof/>
           </w:rPr>
-          <w:t>Figure 10. Setup with MCIO to U.2 Breaker + MCIO Host Card</w:t>
+          <w:t>Figure 13. Setup with MCIO to U.2 Breaker + MCIO Host Card</w:t>
         </w:r>
         <w:r>
           <w:rPr>
@@ -1779,7 +2077,7 @@
             <w:noProof/>
             <w:webHidden/>
           </w:rPr>
-          <w:instrText xml:space="preserve"> PAGEREF _Toc191043693 \h </w:instrText>
+          <w:instrText xml:space="preserve"> PAGEREF _Toc219130228 \h </w:instrText>
         </w:r>
         <w:r>
           <w:rPr>
@@ -1799,7 +2097,7 @@
             <w:noProof/>
             <w:webHidden/>
           </w:rPr>
-          <w:t>12</w:t>
+          <w:t>15</w:t>
         </w:r>
         <w:r>
           <w:rPr>
@@ -1822,7 +2120,7 @@
           <w:lang w:eastAsia="en-GB"/>
         </w:rPr>
       </w:pPr>
-      <w:hyperlink w:anchor="_Toc191043694" w:history="1">
+      <w:hyperlink w:anchor="_Toc219130229" w:history="1">
         <w:r>
           <w:rPr>
             <w:rStyle w:val="Hyperlink"/>
@@ -1831,7 +2129,7 @@
             <w:bCs/>
             <w:noProof/>
           </w:rPr>
-          <w:t>Figure 11. Flow Chart of Setup</w:t>
+          <w:t>Figure 14. Flow Chart of Setup</w:t>
         </w:r>
         <w:r>
           <w:rPr>
@@ -1852,7 +2150,7 @@
             <w:noProof/>
             <w:webHidden/>
           </w:rPr>
-          <w:instrText xml:space="preserve"> PAGEREF _Toc191043694 \h </w:instrText>
+          <w:instrText xml:space="preserve"> PAGEREF _Toc219130229 \h </w:instrText>
         </w:r>
         <w:r>
           <w:rPr>
@@ -1872,7 +2170,7 @@
             <w:noProof/>
             <w:webHidden/>
           </w:rPr>
-          <w:t>13</w:t>
+          <w:t>16</w:t>
         </w:r>
         <w:r>
           <w:rPr>
@@ -1895,7 +2193,7 @@
           <w:lang w:eastAsia="en-GB"/>
         </w:rPr>
       </w:pPr>
-      <w:hyperlink w:anchor="_Toc191043695" w:history="1">
+      <w:hyperlink w:anchor="_Toc219130230" w:history="1">
         <w:r>
           <w:rPr>
             <w:rStyle w:val="Hyperlink"/>
@@ -1904,7 +2202,7 @@
             <w:bCs/>
             <w:noProof/>
           </w:rPr>
-          <w:t>Figure 12. Power Delay Upon Power Up Flow Chart</w:t>
+          <w:t>Figure 15. Power Delay Upon Power Up Flow Chart</w:t>
         </w:r>
         <w:r>
           <w:rPr>
@@ -1925,7 +2223,7 @@
             <w:noProof/>
             <w:webHidden/>
           </w:rPr>
-          <w:instrText xml:space="preserve"> PAGEREF _Toc191043695 \h </w:instrText>
+          <w:instrText xml:space="preserve"> PAGEREF _Toc219130230 \h </w:instrText>
         </w:r>
         <w:r>
           <w:rPr>
@@ -1945,7 +2243,7 @@
             <w:noProof/>
             <w:webHidden/>
           </w:rPr>
-          <w:t>15</w:t>
+          <w:t>18</w:t>
         </w:r>
         <w:r>
           <w:rPr>
@@ -1968,7 +2266,7 @@
           <w:lang w:eastAsia="en-GB"/>
         </w:rPr>
       </w:pPr>
-      <w:hyperlink w:anchor="_Toc191043696" w:history="1">
+      <w:hyperlink w:anchor="_Toc219130231" w:history="1">
         <w:r>
           <w:rPr>
             <w:rStyle w:val="Hyperlink"/>
@@ -1977,7 +2275,7 @@
             <w:bCs/>
             <w:noProof/>
           </w:rPr>
-          <w:t>Figure 13. Requirements</w:t>
+          <w:t>Figure 16. Requirements</w:t>
         </w:r>
         <w:r>
           <w:rPr>
@@ -1998,7 +2296,7 @@
             <w:noProof/>
             <w:webHidden/>
           </w:rPr>
-          <w:instrText xml:space="preserve"> PAGEREF _Toc191043696 \h </w:instrText>
+          <w:instrText xml:space="preserve"> PAGEREF _Toc219130231 \h </w:instrText>
         </w:r>
         <w:r>
           <w:rPr>
@@ -2018,7 +2316,7 @@
             <w:noProof/>
             <w:webHidden/>
           </w:rPr>
-          <w:t>17</w:t>
+          <w:t>20</w:t>
         </w:r>
         <w:r>
           <w:rPr>
@@ -2041,7 +2339,7 @@
           <w:lang w:eastAsia="en-GB"/>
         </w:rPr>
       </w:pPr>
-      <w:hyperlink w:anchor="_Toc191043697" w:history="1">
+      <w:hyperlink w:anchor="_Toc219130232" w:history="1">
         <w:r>
           <w:rPr>
             <w:rStyle w:val="Hyperlink"/>
@@ -2050,7 +2348,7 @@
             <w:bCs/>
             <w:noProof/>
           </w:rPr>
-          <w:t>Figure 14. On Host Power Up Flow Chart</w:t>
+          <w:t>Figure 17. On Host Power Up Flow Chart</w:t>
         </w:r>
         <w:r>
           <w:rPr>
@@ -2071,7 +2369,7 @@
             <w:noProof/>
             <w:webHidden/>
           </w:rPr>
-          <w:instrText xml:space="preserve"> PAGEREF _Toc191043697 \h </w:instrText>
+          <w:instrText xml:space="preserve"> PAGEREF _Toc219130232 \h </w:instrText>
         </w:r>
         <w:r>
           <w:rPr>
@@ -2091,7 +2389,7 @@
             <w:noProof/>
             <w:webHidden/>
           </w:rPr>
-          <w:t>17</w:t>
+          <w:t>20</w:t>
         </w:r>
         <w:r>
           <w:rPr>
@@ -2114,7 +2412,7 @@
           <w:lang w:eastAsia="en-GB"/>
         </w:rPr>
       </w:pPr>
-      <w:hyperlink w:anchor="_Toc191043698" w:history="1">
+      <w:hyperlink w:anchor="_Toc219130233" w:history="1">
         <w:r>
           <w:rPr>
             <w:rStyle w:val="Hyperlink"/>
@@ -2123,7 +2421,7 @@
             <w:bCs/>
             <w:noProof/>
           </w:rPr>
-          <w:t>Figure 15. On Host Power up Setup</w:t>
+          <w:t>Figure 18. On Host Power up Setup</w:t>
         </w:r>
         <w:r>
           <w:rPr>
@@ -2144,7 +2442,7 @@
             <w:noProof/>
             <w:webHidden/>
           </w:rPr>
-          <w:instrText xml:space="preserve"> PAGEREF _Toc191043698 \h </w:instrText>
+          <w:instrText xml:space="preserve"> PAGEREF _Toc219130233 \h </w:instrText>
         </w:r>
         <w:r>
           <w:rPr>
@@ -2164,7 +2462,7 @@
             <w:noProof/>
             <w:webHidden/>
           </w:rPr>
-          <w:t>18</w:t>
+          <w:t>21</w:t>
         </w:r>
         <w:r>
           <w:rPr>
@@ -2197,7 +2495,7 @@
         <w:pStyle w:val="Heading1"/>
       </w:pPr>
       <w:bookmarkStart w:id="12" w:name="_Toc184889527"/>
-      <w:bookmarkStart w:id="13" w:name="_Toc191043703"/>
+      <w:bookmarkStart w:id="13" w:name="_Toc219130204"/>
       <w:r>
         <w:lastRenderedPageBreak/>
         <w:t xml:space="preserve">4. </w:t>
@@ -2299,7 +2597,7 @@
           <w:szCs w:val="24"/>
         </w:rPr>
       </w:pPr>
-      <w:bookmarkStart w:id="14" w:name="_Toc191043684"/>
+      <w:bookmarkStart w:id="14" w:name="_Toc219130216"/>
       <w:r>
         <w:rPr>
           <w:b/>
@@ -2402,7 +2700,7 @@
         <w:pStyle w:val="Heading2"/>
       </w:pPr>
       <w:bookmarkStart w:id="15" w:name="_Toc184889528"/>
-      <w:bookmarkStart w:id="16" w:name="_Toc191043704"/>
+      <w:bookmarkStart w:id="16" w:name="_Toc219130205"/>
       <w:r>
         <w:lastRenderedPageBreak/>
         <w:t xml:space="preserve">5. </w:t>
@@ -2417,7 +2715,7 @@
       <w:pPr>
         <w:pStyle w:val="Heading3"/>
       </w:pPr>
-      <w:bookmarkStart w:id="17" w:name="_Toc191043705"/>
+      <w:bookmarkStart w:id="17" w:name="_Toc219130206"/>
       <w:r>
         <w:t xml:space="preserve">5.1 </w:t>
       </w:r>
@@ -2641,7 +2939,7 @@
           <w:szCs w:val="24"/>
         </w:rPr>
       </w:pPr>
-      <w:bookmarkStart w:id="18" w:name="_Toc191043685"/>
+      <w:bookmarkStart w:id="18" w:name="_Toc219130217"/>
       <w:r>
         <w:rPr>
           <w:b/>
@@ -2884,7 +3182,7 @@
           <w:szCs w:val="24"/>
         </w:rPr>
       </w:pPr>
-      <w:bookmarkStart w:id="19" w:name="_Toc191043686"/>
+      <w:bookmarkStart w:id="19" w:name="_Toc219130218"/>
       <w:r>
         <w:rPr>
           <w:b/>
@@ -3059,7 +3357,7 @@
           <w:szCs w:val="24"/>
         </w:rPr>
       </w:pPr>
-      <w:bookmarkStart w:id="20" w:name="_Toc191043687"/>
+      <w:bookmarkStart w:id="20" w:name="_Toc219130219"/>
       <w:r>
         <w:rPr>
           <w:b/>
@@ -3243,7 +3541,29 @@
             <w:spacing w:val="-1"/>
             <w:shd w:val="clear" w:color="auto" w:fill="FFFFFF"/>
           </w:rPr>
-          <w:t xml:space="preserve"> GUI - Quarch Technology</w:t>
+          <w:t xml:space="preserve"> GUI - </w:t>
+        </w:r>
+        <w:proofErr w:type="spellStart"/>
+        <w:r>
+          <w:rPr>
+            <w:rStyle w:val="smart-link-title-wrapper"/>
+            <w:rFonts w:ascii="Segoe UI" w:hAnsi="Segoe UI" w:cs="Segoe UI"/>
+            <w:color w:val="0000FF"/>
+            <w:spacing w:val="-1"/>
+            <w:shd w:val="clear" w:color="auto" w:fill="FFFFFF"/>
+          </w:rPr>
+          <w:t>Quarch</w:t>
+        </w:r>
+        <w:proofErr w:type="spellEnd"/>
+        <w:r>
+          <w:rPr>
+            <w:rStyle w:val="smart-link-title-wrapper"/>
+            <w:rFonts w:ascii="Segoe UI" w:hAnsi="Segoe UI" w:cs="Segoe UI"/>
+            <w:color w:val="0000FF"/>
+            <w:spacing w:val="-1"/>
+            <w:shd w:val="clear" w:color="auto" w:fill="FFFFFF"/>
+          </w:rPr>
+          <w:t xml:space="preserve"> Technology</w:t>
         </w:r>
       </w:hyperlink>
     </w:p>
@@ -3410,7 +3730,23 @@
           <w:b/>
           <w:bCs/>
         </w:rPr>
-        <w:t>TRIGger:IN:SOURCE:SIDEband</w:t>
+        <w:t>TRIGger:</w:t>
+      </w:r>
+      <w:proofErr w:type="gramStart"/>
+      <w:r>
+        <w:rPr>
+          <w:b/>
+          <w:bCs/>
+        </w:rPr>
+        <w:t>IN:SOURCE</w:t>
+      </w:r>
+      <w:proofErr w:type="gramEnd"/>
+      <w:r>
+        <w:rPr>
+          <w:b/>
+          <w:bCs/>
+        </w:rPr>
+        <w:t>:SIDEband</w:t>
       </w:r>
       <w:proofErr w:type="spellEnd"/>
     </w:p>
@@ -3445,9 +3781,34 @@
           <w:b/>
           <w:bCs/>
         </w:rPr>
-        <w:t>[IN|OUT]:[SIGNAL-NAME]:[</w:t>
+        <w:t>[IN|OUT</w:t>
+      </w:r>
+      <w:proofErr w:type="gramStart"/>
+      <w:r>
+        <w:rPr>
+          <w:b/>
+          <w:bCs/>
+        </w:rPr>
+        <w:t>]:[</w:t>
+      </w:r>
+      <w:proofErr w:type="gramEnd"/>
+      <w:r>
+        <w:rPr>
+          <w:b/>
+          <w:bCs/>
+        </w:rPr>
+        <w:t>SIGNAL-NAME</w:t>
+      </w:r>
+      <w:proofErr w:type="gramStart"/>
+      <w:r>
+        <w:rPr>
+          <w:b/>
+          <w:bCs/>
+        </w:rPr>
+        <w:t>]:[</w:t>
       </w:r>
       <w:proofErr w:type="spellStart"/>
+      <w:proofErr w:type="gramEnd"/>
       <w:r>
         <w:rPr>
           <w:b/>
@@ -3540,7 +3901,7 @@
           <w:szCs w:val="24"/>
         </w:rPr>
       </w:pPr>
-      <w:bookmarkStart w:id="21" w:name="_Toc191043688"/>
+      <w:bookmarkStart w:id="21" w:name="_Toc219130220"/>
       <w:r>
         <w:rPr>
           <w:b/>
@@ -3732,7 +4093,7 @@
           <w:szCs w:val="24"/>
         </w:rPr>
       </w:pPr>
-      <w:bookmarkStart w:id="22" w:name="_Toc191043689"/>
+      <w:bookmarkStart w:id="22" w:name="_Toc219130221"/>
       <w:r>
         <w:rPr>
           <w:b/>
@@ -3943,7 +4304,7 @@
           <w:szCs w:val="24"/>
         </w:rPr>
       </w:pPr>
-      <w:bookmarkStart w:id="23" w:name="_Toc191043690"/>
+      <w:bookmarkStart w:id="23" w:name="_Toc219130222"/>
       <w:r>
         <w:rPr>
           <w:b/>
@@ -4033,19 +4394,294 @@
     </w:p>
     <w:p>
       <w:pPr>
-        <w:rPr>
-          <w:b/>
-          <w:bCs/>
-        </w:rPr>
-      </w:pPr>
-      <w:r>
         <w:rPr>
           <w:b/>
           <w:bCs/>
           <w:i/>
           <w:iCs/>
         </w:rPr>
+      </w:pPr>
+      <w:r>
+        <w:rPr>
+          <w:b/>
+          <w:bCs/>
+          <w:i/>
+          <w:iCs/>
+        </w:rPr>
         <w:br w:type="page"/>
+      </w:r>
+    </w:p>
+    <w:p>
+      <w:pPr>
+        <w:pStyle w:val="Heading3"/>
+      </w:pPr>
+      <w:bookmarkStart w:id="24" w:name="_Toc219130207"/>
+      <w:r>
+        <w:lastRenderedPageBreak/>
+        <w:t>5.2</w:t>
+      </w:r>
+      <w:r>
+        <w:t xml:space="preserve"> </w:t>
+      </w:r>
+      <w:r>
+        <w:t>Power Sequencing – PCIe CEM Specification</w:t>
+      </w:r>
+      <w:bookmarkEnd w:id="24"/>
+    </w:p>
+    <w:p>
+      <w:pPr>
+        <w:rPr>
+          <w:u w:val="single"/>
+        </w:rPr>
+      </w:pPr>
+      <w:r>
+        <w:rPr>
+          <w:u w:val="single"/>
+        </w:rPr>
+        <w:t>Introduction</w:t>
+      </w:r>
+    </w:p>
+    <w:p>
+      <w:r>
+        <w:t xml:space="preserve">Part of the PCIe Card </w:t>
+      </w:r>
+      <w:proofErr w:type="spellStart"/>
+      <w:r>
+        <w:t>ElectroMechanical</w:t>
+      </w:r>
+      <w:proofErr w:type="spellEnd"/>
+      <w:r>
+        <w:t xml:space="preserve"> spec is power sequencing. Section 4.4 states “</w:t>
+      </w:r>
+      <w:r>
+        <w:t>There is no specific requirement for power supply sequencing of the power supply rails, whether delivered by the system board or cables. They may come up or go down in any order</w:t>
+      </w:r>
+      <w:r>
+        <w:rPr>
+          <w:rStyle w:val="FootnoteReference"/>
+        </w:rPr>
+        <w:footnoteReference w:id="1"/>
+      </w:r>
+      <w:r>
+        <w:t xml:space="preserve">”. This application note can be used to help verify compliance with the CEM Spec. </w:t>
+      </w:r>
+    </w:p>
+    <w:p>
+      <w:pPr>
+        <w:rPr>
+          <w:u w:val="single"/>
+        </w:rPr>
+      </w:pPr>
+      <w:r>
+        <w:rPr>
+          <w:u w:val="single"/>
+        </w:rPr>
+        <w:t>Requirements</w:t>
+      </w:r>
+    </w:p>
+    <w:p>
+      <w:pPr>
+        <w:pStyle w:val="ListParagraph"/>
+        <w:numPr>
+          <w:ilvl w:val="0"/>
+          <w:numId w:val="9"/>
+        </w:numPr>
+      </w:pPr>
+      <w:r>
+        <w:t>Python (3.x recommended)</w:t>
+      </w:r>
+    </w:p>
+    <w:p>
+      <w:pPr>
+        <w:pStyle w:val="ListParagraph"/>
+        <w:numPr>
+          <w:ilvl w:val="0"/>
+          <w:numId w:val="9"/>
+        </w:numPr>
+      </w:pPr>
+      <w:proofErr w:type="spellStart"/>
+      <w:r>
+        <w:t>Quarchpy</w:t>
+      </w:r>
+      <w:proofErr w:type="spellEnd"/>
+      <w:r>
+        <w:t xml:space="preserve"> python package</w:t>
+      </w:r>
+    </w:p>
+    <w:p>
+      <w:pPr>
+        <w:pStyle w:val="ListParagraph"/>
+        <w:numPr>
+          <w:ilvl w:val="0"/>
+          <w:numId w:val="9"/>
+        </w:numPr>
+      </w:pPr>
+      <w:proofErr w:type="spellStart"/>
+      <w:r>
+        <w:t>Quarch</w:t>
+      </w:r>
+      <w:proofErr w:type="spellEnd"/>
+      <w:r>
+        <w:t xml:space="preserve"> USB Driver</w:t>
+      </w:r>
+    </w:p>
+    <w:p>
+      <w:pPr>
+        <w:pStyle w:val="ListParagraph"/>
+        <w:numPr>
+          <w:ilvl w:val="0"/>
+          <w:numId w:val="9"/>
+        </w:numPr>
+      </w:pPr>
+      <w:r>
+        <w:t>Check USB permissions if using Linux</w:t>
+      </w:r>
+    </w:p>
+    <w:p>
+      <w:pPr>
+        <w:pStyle w:val="ListParagraph"/>
+        <w:numPr>
+          <w:ilvl w:val="0"/>
+          <w:numId w:val="9"/>
+        </w:numPr>
+      </w:pPr>
+      <w:r>
+        <w:t>Host PC</w:t>
+      </w:r>
+      <w:r>
+        <w:t xml:space="preserve"> with an available PCIe slot</w:t>
+      </w:r>
+    </w:p>
+    <w:p>
+      <w:pPr>
+        <w:pStyle w:val="ListParagraph"/>
+        <w:numPr>
+          <w:ilvl w:val="0"/>
+          <w:numId w:val="9"/>
+        </w:numPr>
+      </w:pPr>
+      <w:r>
+        <w:t>Control PC</w:t>
+      </w:r>
+    </w:p>
+    <w:p>
+      <w:pPr>
+        <w:pStyle w:val="ListParagraph"/>
+        <w:numPr>
+          <w:ilvl w:val="0"/>
+          <w:numId w:val="9"/>
+        </w:numPr>
+        <w:rPr>
+          <w:u w:val="single"/>
+        </w:rPr>
+      </w:pPr>
+      <w:proofErr w:type="spellStart"/>
+      <w:r>
+        <w:t>Quarch</w:t>
+      </w:r>
+      <w:proofErr w:type="spellEnd"/>
+      <w:r>
+        <w:t xml:space="preserve"> PAM, and PAM Fixture</w:t>
+      </w:r>
+    </w:p>
+    <w:p>
+      <w:pPr>
+        <w:pStyle w:val="ListParagraph"/>
+        <w:numPr>
+          <w:ilvl w:val="0"/>
+          <w:numId w:val="9"/>
+        </w:numPr>
+        <w:rPr>
+          <w:u w:val="single"/>
+        </w:rPr>
+      </w:pPr>
+      <w:proofErr w:type="spellStart"/>
+      <w:r>
+        <w:t>Quarch</w:t>
+      </w:r>
+      <w:proofErr w:type="spellEnd"/>
+      <w:r>
+        <w:t xml:space="preserve"> Breaker, and Torridon Fixture</w:t>
+      </w:r>
+    </w:p>
+    <w:p>
+      <w:pPr>
+        <w:pStyle w:val="ListParagraph"/>
+        <w:numPr>
+          <w:ilvl w:val="0"/>
+          <w:numId w:val="9"/>
+        </w:numPr>
+        <w:rPr>
+          <w:u w:val="single"/>
+        </w:rPr>
+      </w:pPr>
+      <w:r>
+        <w:t>PCIe Add-In Card</w:t>
+      </w:r>
+    </w:p>
+    <w:p>
+      <w:pPr>
+        <w:rPr>
+          <w:u w:val="single"/>
+        </w:rPr>
+      </w:pPr>
+      <w:r>
+        <w:rPr>
+          <w:u w:val="single"/>
+        </w:rPr>
+        <w:t>Set-up</w:t>
+      </w:r>
+    </w:p>
+    <w:p>
+      <w:pPr>
+        <w:keepNext/>
+      </w:pPr>
+      <w:r>
+        <w:rPr>
+          <w:noProof/>
+          <w:u w:val="single"/>
+        </w:rPr>
+        <w:drawing>
+          <wp:inline distT="0" distB="0" distL="0" distR="0" wp14:anchorId="5B3A3989" wp14:editId="44BB2787">
+            <wp:extent cx="5731510" cy="3227070"/>
+            <wp:effectExtent l="0" t="0" r="2540" b="0"/>
+            <wp:docPr id="832716536" name="Picture 1"/>
+            <wp:cNvGraphicFramePr>
+              <a:graphicFrameLocks xmlns:a="http://schemas.openxmlformats.org/drawingml/2006/main" noChangeAspect="1"/>
+            </wp:cNvGraphicFramePr>
+            <a:graphic xmlns:a="http://schemas.openxmlformats.org/drawingml/2006/main">
+              <a:graphicData uri="http://schemas.openxmlformats.org/drawingml/2006/picture">
+                <pic:pic xmlns:pic="http://schemas.openxmlformats.org/drawingml/2006/picture">
+                  <pic:nvPicPr>
+                    <pic:cNvPr id="832716536" name="Picture 832716536"/>
+                    <pic:cNvPicPr/>
+                  </pic:nvPicPr>
+                  <pic:blipFill>
+                    <a:blip r:embed="rId17" cstate="print">
+                      <a:extLst>
+                        <a:ext uri="{28A0092B-C50C-407E-A947-70E740481C1C}">
+                          <a14:useLocalDpi xmlns:a14="http://schemas.microsoft.com/office/drawing/2010/main" val="0"/>
+                        </a:ext>
+                      </a:extLst>
+                    </a:blip>
+                    <a:stretch>
+                      <a:fillRect/>
+                    </a:stretch>
+                  </pic:blipFill>
+                  <pic:spPr>
+                    <a:xfrm>
+                      <a:off x="0" y="0"/>
+                      <a:ext cx="5731510" cy="3227070"/>
+                    </a:xfrm>
+                    <a:prstGeom prst="rect">
+                      <a:avLst/>
+                    </a:prstGeom>
+                  </pic:spPr>
+                </pic:pic>
+              </a:graphicData>
+            </a:graphic>
+          </wp:inline>
+        </w:drawing>
       </w:r>
     </w:p>
     <w:p>
@@ -4062,13 +4698,684 @@
           <w:szCs w:val="24"/>
         </w:rPr>
       </w:pPr>
+      <w:bookmarkStart w:id="25" w:name="_Toc219130223"/>
+      <w:r>
+        <w:rPr>
+          <w:b/>
+          <w:bCs/>
+          <w:i w:val="0"/>
+          <w:iCs w:val="0"/>
+          <w:color w:val="auto"/>
+          <w:sz w:val="24"/>
+          <w:szCs w:val="24"/>
+        </w:rPr>
+        <w:t xml:space="preserve">Figure </w:t>
+      </w:r>
+      <w:r>
+        <w:rPr>
+          <w:b/>
+          <w:bCs/>
+          <w:i w:val="0"/>
+          <w:iCs w:val="0"/>
+          <w:color w:val="auto"/>
+          <w:sz w:val="24"/>
+          <w:szCs w:val="24"/>
+        </w:rPr>
+        <w:fldChar w:fldCharType="begin"/>
+      </w:r>
+      <w:r>
+        <w:rPr>
+          <w:b/>
+          <w:bCs/>
+          <w:i w:val="0"/>
+          <w:iCs w:val="0"/>
+          <w:color w:val="auto"/>
+          <w:sz w:val="24"/>
+          <w:szCs w:val="24"/>
+        </w:rPr>
+        <w:instrText xml:space="preserve"> SEQ Figure \* ARABIC </w:instrText>
+      </w:r>
+      <w:r>
+        <w:rPr>
+          <w:b/>
+          <w:bCs/>
+          <w:i w:val="0"/>
+          <w:iCs w:val="0"/>
+          <w:color w:val="auto"/>
+          <w:sz w:val="24"/>
+          <w:szCs w:val="24"/>
+        </w:rPr>
+        <w:fldChar w:fldCharType="separate"/>
+      </w:r>
+      <w:r>
+        <w:rPr>
+          <w:b/>
+          <w:bCs/>
+          <w:i w:val="0"/>
+          <w:iCs w:val="0"/>
+          <w:noProof/>
+          <w:color w:val="auto"/>
+          <w:sz w:val="24"/>
+          <w:szCs w:val="24"/>
+        </w:rPr>
+        <w:t>8</w:t>
+      </w:r>
+      <w:r>
+        <w:rPr>
+          <w:b/>
+          <w:bCs/>
+          <w:i w:val="0"/>
+          <w:iCs w:val="0"/>
+          <w:color w:val="auto"/>
+          <w:sz w:val="24"/>
+          <w:szCs w:val="24"/>
+        </w:rPr>
+        <w:fldChar w:fldCharType="end"/>
+      </w:r>
+      <w:r>
+        <w:rPr>
+          <w:b/>
+          <w:bCs/>
+          <w:i w:val="0"/>
+          <w:iCs w:val="0"/>
+          <w:color w:val="auto"/>
+          <w:sz w:val="24"/>
+          <w:szCs w:val="24"/>
+        </w:rPr>
+        <w:t xml:space="preserve"> - Power Sequencing Set-up</w:t>
+      </w:r>
+      <w:bookmarkEnd w:id="25"/>
+    </w:p>
+    <w:p>
+      <w:r>
+        <w:lastRenderedPageBreak/>
+        <w:t>This setup used a PCIe riser, due to space constraints.</w:t>
+      </w:r>
+    </w:p>
+    <w:p>
+      <w:r>
+        <w:rPr>
+          <w:noProof/>
+        </w:rPr>
+        <mc:AlternateContent>
+          <mc:Choice Requires="wps">
+            <w:drawing>
+              <wp:anchor distT="0" distB="0" distL="114300" distR="114300" simplePos="0" relativeHeight="251660288" behindDoc="0" locked="0" layoutInCell="1" allowOverlap="1" wp14:anchorId="4ACC0D61" wp14:editId="4F6AD2E7">
+                <wp:simplePos x="0" y="0"/>
+                <wp:positionH relativeFrom="column">
+                  <wp:posOffset>0</wp:posOffset>
+                </wp:positionH>
+                <wp:positionV relativeFrom="paragraph">
+                  <wp:posOffset>6482080</wp:posOffset>
+                </wp:positionV>
+                <wp:extent cx="5459095" cy="635"/>
+                <wp:effectExtent l="0" t="0" r="0" b="0"/>
+                <wp:wrapSquare wrapText="bothSides"/>
+                <wp:docPr id="855072335" name="Text Box 1"/>
+                <wp:cNvGraphicFramePr/>
+                <a:graphic xmlns:a="http://schemas.openxmlformats.org/drawingml/2006/main">
+                  <a:graphicData uri="http://schemas.microsoft.com/office/word/2010/wordprocessingShape">
+                    <wps:wsp>
+                      <wps:cNvSpPr txBox="1"/>
+                      <wps:spPr>
+                        <a:xfrm>
+                          <a:off x="0" y="0"/>
+                          <a:ext cx="5459095" cy="635"/>
+                        </a:xfrm>
+                        <a:prstGeom prst="rect">
+                          <a:avLst/>
+                        </a:prstGeom>
+                        <a:solidFill>
+                          <a:prstClr val="white"/>
+                        </a:solidFill>
+                        <a:ln>
+                          <a:noFill/>
+                        </a:ln>
+                      </wps:spPr>
+                      <wps:txbx>
+                        <w:txbxContent>
+                          <w:p>
+                            <w:pPr>
+                              <w:pStyle w:val="Caption"/>
+                              <w:jc w:val="center"/>
+                              <w:rPr>
+                                <w:b/>
+                                <w:bCs/>
+                                <w:i w:val="0"/>
+                                <w:iCs w:val="0"/>
+                                <w:color w:val="auto"/>
+                                <w:sz w:val="24"/>
+                                <w:szCs w:val="24"/>
+                              </w:rPr>
+                            </w:pPr>
+                            <w:bookmarkStart w:id="26" w:name="_Toc219130224"/>
+                            <w:r>
+                              <w:rPr>
+                                <w:b/>
+                                <w:bCs/>
+                                <w:i w:val="0"/>
+                                <w:iCs w:val="0"/>
+                                <w:color w:val="auto"/>
+                                <w:sz w:val="24"/>
+                                <w:szCs w:val="24"/>
+                              </w:rPr>
+                              <w:t xml:space="preserve">Figure </w:t>
+                            </w:r>
+                            <w:r>
+                              <w:rPr>
+                                <w:b/>
+                                <w:bCs/>
+                                <w:i w:val="0"/>
+                                <w:iCs w:val="0"/>
+                                <w:color w:val="auto"/>
+                                <w:sz w:val="24"/>
+                                <w:szCs w:val="24"/>
+                              </w:rPr>
+                              <w:fldChar w:fldCharType="begin"/>
+                            </w:r>
+                            <w:r>
+                              <w:rPr>
+                                <w:b/>
+                                <w:bCs/>
+                                <w:i w:val="0"/>
+                                <w:iCs w:val="0"/>
+                                <w:color w:val="auto"/>
+                                <w:sz w:val="24"/>
+                                <w:szCs w:val="24"/>
+                              </w:rPr>
+                              <w:instrText xml:space="preserve"> SEQ Figure \* ARABIC </w:instrText>
+                            </w:r>
+                            <w:r>
+                              <w:rPr>
+                                <w:b/>
+                                <w:bCs/>
+                                <w:i w:val="0"/>
+                                <w:iCs w:val="0"/>
+                                <w:color w:val="auto"/>
+                                <w:sz w:val="24"/>
+                                <w:szCs w:val="24"/>
+                              </w:rPr>
+                              <w:fldChar w:fldCharType="separate"/>
+                            </w:r>
+                            <w:r>
+                              <w:rPr>
+                                <w:b/>
+                                <w:bCs/>
+                                <w:i w:val="0"/>
+                                <w:iCs w:val="0"/>
+                                <w:noProof/>
+                                <w:color w:val="auto"/>
+                                <w:sz w:val="24"/>
+                                <w:szCs w:val="24"/>
+                              </w:rPr>
+                              <w:t>9</w:t>
+                            </w:r>
+                            <w:r>
+                              <w:rPr>
+                                <w:b/>
+                                <w:bCs/>
+                                <w:i w:val="0"/>
+                                <w:iCs w:val="0"/>
+                                <w:color w:val="auto"/>
+                                <w:sz w:val="24"/>
+                                <w:szCs w:val="24"/>
+                              </w:rPr>
+                              <w:fldChar w:fldCharType="end"/>
+                            </w:r>
+                            <w:r>
+                              <w:rPr>
+                                <w:b/>
+                                <w:bCs/>
+                                <w:i w:val="0"/>
+                                <w:iCs w:val="0"/>
+                                <w:color w:val="auto"/>
+                                <w:sz w:val="24"/>
+                                <w:szCs w:val="24"/>
+                              </w:rPr>
+                              <w:t xml:space="preserve"> - Setup</w:t>
+                            </w:r>
+                            <w:bookmarkEnd w:id="26"/>
+                          </w:p>
+                        </w:txbxContent>
+                      </wps:txbx>
+                      <wps:bodyPr rot="0" spcFirstLastPara="0" vertOverflow="overflow" horzOverflow="overflow" vert="horz" wrap="square" lIns="0" tIns="0" rIns="0" bIns="0" numCol="1" spcCol="0" rtlCol="0" fromWordArt="0" anchor="t" anchorCtr="0" forceAA="0" compatLnSpc="1">
+                        <a:prstTxWarp prst="textNoShape">
+                          <a:avLst/>
+                        </a:prstTxWarp>
+                        <a:spAutoFit/>
+                      </wps:bodyPr>
+                    </wps:wsp>
+                  </a:graphicData>
+                </a:graphic>
+              </wp:anchor>
+            </w:drawing>
+          </mc:Choice>
+          <mc:Fallback>
+            <w:pict>
+              <v:shapetype w14:anchorId="4ACC0D61" id="_x0000_t202" coordsize="21600,21600" o:spt="202" path="m,l,21600r21600,l21600,xe">
+                <v:stroke joinstyle="miter"/>
+                <v:path gradientshapeok="t" o:connecttype="rect"/>
+              </v:shapetype>
+              <v:shape id="Text Box 1" o:spid="_x0000_s1026" type="#_x0000_t202" style="position:absolute;margin-left:0;margin-top:510.4pt;width:429.85pt;height:.05pt;z-index:251660288;visibility:visible;mso-wrap-style:square;mso-wrap-distance-left:9pt;mso-wrap-distance-top:0;mso-wrap-distance-right:9pt;mso-wrap-distance-bottom:0;mso-position-horizontal:absolute;mso-position-horizontal-relative:text;mso-position-vertical:absolute;mso-position-vertical-relative:text;v-text-anchor:top" o:gfxdata="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" stroked="f">
+                <v:textbox style="mso-fit-shape-to-text:t" inset="0,0,0,0">
+                  <w:txbxContent>
+                    <w:p>
+                      <w:pPr>
+                        <w:pStyle w:val="Caption"/>
+                        <w:jc w:val="center"/>
+                        <w:rPr>
+                          <w:b/>
+                          <w:bCs/>
+                          <w:i w:val="0"/>
+                          <w:iCs w:val="0"/>
+                          <w:color w:val="auto"/>
+                          <w:sz w:val="24"/>
+                          <w:szCs w:val="24"/>
+                        </w:rPr>
+                      </w:pPr>
+                      <w:bookmarkStart w:id="27" w:name="_Toc219130224"/>
+                      <w:r>
+                        <w:rPr>
+                          <w:b/>
+                          <w:bCs/>
+                          <w:i w:val="0"/>
+                          <w:iCs w:val="0"/>
+                          <w:color w:val="auto"/>
+                          <w:sz w:val="24"/>
+                          <w:szCs w:val="24"/>
+                        </w:rPr>
+                        <w:t xml:space="preserve">Figure </w:t>
+                      </w:r>
+                      <w:r>
+                        <w:rPr>
+                          <w:b/>
+                          <w:bCs/>
+                          <w:i w:val="0"/>
+                          <w:iCs w:val="0"/>
+                          <w:color w:val="auto"/>
+                          <w:sz w:val="24"/>
+                          <w:szCs w:val="24"/>
+                        </w:rPr>
+                        <w:fldChar w:fldCharType="begin"/>
+                      </w:r>
+                      <w:r>
+                        <w:rPr>
+                          <w:b/>
+                          <w:bCs/>
+                          <w:i w:val="0"/>
+                          <w:iCs w:val="0"/>
+                          <w:color w:val="auto"/>
+                          <w:sz w:val="24"/>
+                          <w:szCs w:val="24"/>
+                        </w:rPr>
+                        <w:instrText xml:space="preserve"> SEQ Figure \* ARABIC </w:instrText>
+                      </w:r>
+                      <w:r>
+                        <w:rPr>
+                          <w:b/>
+                          <w:bCs/>
+                          <w:i w:val="0"/>
+                          <w:iCs w:val="0"/>
+                          <w:color w:val="auto"/>
+                          <w:sz w:val="24"/>
+                          <w:szCs w:val="24"/>
+                        </w:rPr>
+                        <w:fldChar w:fldCharType="separate"/>
+                      </w:r>
+                      <w:r>
+                        <w:rPr>
+                          <w:b/>
+                          <w:bCs/>
+                          <w:i w:val="0"/>
+                          <w:iCs w:val="0"/>
+                          <w:noProof/>
+                          <w:color w:val="auto"/>
+                          <w:sz w:val="24"/>
+                          <w:szCs w:val="24"/>
+                        </w:rPr>
+                        <w:t>9</w:t>
+                      </w:r>
+                      <w:r>
+                        <w:rPr>
+                          <w:b/>
+                          <w:bCs/>
+                          <w:i w:val="0"/>
+                          <w:iCs w:val="0"/>
+                          <w:color w:val="auto"/>
+                          <w:sz w:val="24"/>
+                          <w:szCs w:val="24"/>
+                        </w:rPr>
+                        <w:fldChar w:fldCharType="end"/>
+                      </w:r>
+                      <w:r>
+                        <w:rPr>
+                          <w:b/>
+                          <w:bCs/>
+                          <w:i w:val="0"/>
+                          <w:iCs w:val="0"/>
+                          <w:color w:val="auto"/>
+                          <w:sz w:val="24"/>
+                          <w:szCs w:val="24"/>
+                        </w:rPr>
+                        <w:t xml:space="preserve"> - Setup</w:t>
+                      </w:r>
+                      <w:bookmarkEnd w:id="27"/>
+                    </w:p>
+                  </w:txbxContent>
+                </v:textbox>
+                <w10:wrap type="square"/>
+              </v:shape>
+            </w:pict>
+          </mc:Fallback>
+        </mc:AlternateContent>
+      </w:r>
+      <w:r>
+        <w:drawing>
+          <wp:anchor distT="0" distB="0" distL="114300" distR="114300" simplePos="0" relativeHeight="251658240" behindDoc="0" locked="0" layoutInCell="1" allowOverlap="1" wp14:anchorId="63B8AE9E" wp14:editId="3EEFF213">
+            <wp:simplePos x="0" y="0"/>
+            <wp:positionH relativeFrom="margin">
+              <wp:align>left</wp:align>
+            </wp:positionH>
+            <wp:positionV relativeFrom="paragraph">
+              <wp:posOffset>965835</wp:posOffset>
+            </wp:positionV>
+            <wp:extent cx="5459095" cy="5459095"/>
+            <wp:effectExtent l="0" t="0" r="0" b="0"/>
+            <wp:wrapSquare wrapText="bothSides"/>
+            <wp:docPr id="30304298" name="Picture 3"/>
+            <wp:cNvGraphicFramePr>
+              <a:graphicFrameLocks xmlns:a="http://schemas.openxmlformats.org/drawingml/2006/main" noChangeAspect="1"/>
+            </wp:cNvGraphicFramePr>
+            <a:graphic xmlns:a="http://schemas.openxmlformats.org/drawingml/2006/main">
+              <a:graphicData uri="http://schemas.openxmlformats.org/drawingml/2006/picture">
+                <pic:pic xmlns:pic="http://schemas.openxmlformats.org/drawingml/2006/picture">
+                  <pic:nvPicPr>
+                    <pic:cNvPr id="0" name="Picture 6"/>
+                    <pic:cNvPicPr>
+                      <a:picLocks noChangeAspect="1" noChangeArrowheads="1"/>
+                    </pic:cNvPicPr>
+                  </pic:nvPicPr>
+                  <pic:blipFill>
+                    <a:blip r:embed="rId18" cstate="print">
+                      <a:extLst>
+                        <a:ext uri="{28A0092B-C50C-407E-A947-70E740481C1C}">
+                          <a14:useLocalDpi xmlns:a14="http://schemas.microsoft.com/office/drawing/2010/main" val="0"/>
+                        </a:ext>
+                      </a:extLst>
+                    </a:blip>
+                    <a:srcRect/>
+                    <a:stretch>
+                      <a:fillRect/>
+                    </a:stretch>
+                  </pic:blipFill>
+                  <pic:spPr bwMode="auto">
+                    <a:xfrm>
+                      <a:off x="0" y="0"/>
+                      <a:ext cx="5459095" cy="5459095"/>
+                    </a:xfrm>
+                    <a:prstGeom prst="rect">
+                      <a:avLst/>
+                    </a:prstGeom>
+                    <a:noFill/>
+                    <a:ln>
+                      <a:noFill/>
+                    </a:ln>
+                  </pic:spPr>
+                </pic:pic>
+              </a:graphicData>
+            </a:graphic>
+            <wp14:sizeRelH relativeFrom="page">
+              <wp14:pctWidth>0</wp14:pctWidth>
+            </wp14:sizeRelH>
+            <wp14:sizeRelV relativeFrom="page">
+              <wp14:pctHeight>0</wp14:pctHeight>
+            </wp14:sizeRelV>
+          </wp:anchor>
+        </w:drawing>
+      </w:r>
+      <w:r>
+        <w:t>The breaker used was a QTL2358 Card Module, with a single port Torridon Controller (QTL1260). The PAM fixture used was a QTL2910 AIC PAM Fixture, with a QTL2312 PAM. The PCIe AIC used was a SerialCables Hostcard</w:t>
+      </w:r>
+      <w:r>
+        <w:t>.</w:t>
+      </w:r>
+    </w:p>
+    <w:p/>
+    <w:p>
+      <w:pPr>
+        <w:rPr>
+          <w:u w:val="single"/>
+        </w:rPr>
+      </w:pPr>
+      <w:r>
+        <w:rPr>
+          <w:u w:val="single"/>
+        </w:rPr>
+        <w:t>Results</w:t>
+      </w:r>
+    </w:p>
+    <w:p>
+      <w:pPr>
+        <w:keepNext/>
+      </w:pPr>
+      <w:r>
+        <w:rPr>
+          <w:b/>
+          <w:bCs/>
+        </w:rPr>
+        <w:lastRenderedPageBreak/>
+        <w:drawing>
+          <wp:inline distT="0" distB="0" distL="0" distR="0" wp14:anchorId="0E5D60FC" wp14:editId="25EF06E4">
+            <wp:extent cx="5731510" cy="2518410"/>
+            <wp:effectExtent l="0" t="0" r="2540" b="0"/>
+            <wp:docPr id="1009045215" name="Picture 1"/>
+            <wp:cNvGraphicFramePr>
+              <a:graphicFrameLocks xmlns:a="http://schemas.openxmlformats.org/drawingml/2006/main" noChangeAspect="1"/>
+            </wp:cNvGraphicFramePr>
+            <a:graphic xmlns:a="http://schemas.openxmlformats.org/drawingml/2006/main">
+              <a:graphicData uri="http://schemas.openxmlformats.org/drawingml/2006/picture">
+                <pic:pic xmlns:pic="http://schemas.openxmlformats.org/drawingml/2006/picture">
+                  <pic:nvPicPr>
+                    <pic:cNvPr id="1009045215" name=""/>
+                    <pic:cNvPicPr/>
+                  </pic:nvPicPr>
+                  <pic:blipFill>
+                    <a:blip r:embed="rId19"/>
+                    <a:stretch>
+                      <a:fillRect/>
+                    </a:stretch>
+                  </pic:blipFill>
+                  <pic:spPr>
+                    <a:xfrm>
+                      <a:off x="0" y="0"/>
+                      <a:ext cx="5731510" cy="2518410"/>
+                    </a:xfrm>
+                    <a:prstGeom prst="rect">
+                      <a:avLst/>
+                    </a:prstGeom>
+                  </pic:spPr>
+                </pic:pic>
+              </a:graphicData>
+            </a:graphic>
+          </wp:inline>
+        </w:drawing>
+      </w:r>
+    </w:p>
+    <w:p>
+      <w:pPr>
+        <w:pStyle w:val="Caption"/>
+        <w:jc w:val="center"/>
+        <w:rPr>
+          <w:b/>
+          <w:bCs/>
+          <w:i w:val="0"/>
+          <w:iCs w:val="0"/>
+          <w:sz w:val="24"/>
+          <w:szCs w:val="24"/>
+        </w:rPr>
+      </w:pPr>
+      <w:bookmarkStart w:id="28" w:name="_Toc219130225"/>
+      <w:r>
+        <w:rPr>
+          <w:b/>
+          <w:bCs/>
+          <w:i w:val="0"/>
+          <w:iCs w:val="0"/>
+          <w:sz w:val="24"/>
+          <w:szCs w:val="24"/>
+        </w:rPr>
+        <w:t xml:space="preserve">Figure </w:t>
+      </w:r>
+      <w:r>
+        <w:rPr>
+          <w:b/>
+          <w:bCs/>
+          <w:i w:val="0"/>
+          <w:iCs w:val="0"/>
+          <w:sz w:val="24"/>
+          <w:szCs w:val="24"/>
+        </w:rPr>
+        <w:fldChar w:fldCharType="begin"/>
+      </w:r>
+      <w:r>
+        <w:rPr>
+          <w:b/>
+          <w:bCs/>
+          <w:i w:val="0"/>
+          <w:iCs w:val="0"/>
+          <w:sz w:val="24"/>
+          <w:szCs w:val="24"/>
+        </w:rPr>
+        <w:instrText xml:space="preserve"> SEQ Figure \* ARABIC </w:instrText>
+      </w:r>
+      <w:r>
+        <w:rPr>
+          <w:b/>
+          <w:bCs/>
+          <w:i w:val="0"/>
+          <w:iCs w:val="0"/>
+          <w:sz w:val="24"/>
+          <w:szCs w:val="24"/>
+        </w:rPr>
+        <w:fldChar w:fldCharType="separate"/>
+      </w:r>
+      <w:r>
+        <w:rPr>
+          <w:b/>
+          <w:bCs/>
+          <w:i w:val="0"/>
+          <w:iCs w:val="0"/>
+          <w:noProof/>
+          <w:sz w:val="24"/>
+          <w:szCs w:val="24"/>
+        </w:rPr>
+        <w:t>10</w:t>
+      </w:r>
+      <w:r>
+        <w:rPr>
+          <w:b/>
+          <w:bCs/>
+          <w:i w:val="0"/>
+          <w:iCs w:val="0"/>
+          <w:sz w:val="24"/>
+          <w:szCs w:val="24"/>
+        </w:rPr>
+        <w:fldChar w:fldCharType="end"/>
+      </w:r>
+      <w:r>
+        <w:rPr>
+          <w:b/>
+          <w:bCs/>
+          <w:i w:val="0"/>
+          <w:iCs w:val="0"/>
+          <w:sz w:val="24"/>
+          <w:szCs w:val="24"/>
+        </w:rPr>
+        <w:t xml:space="preserve"> - QPS Trace of Power Sequencing</w:t>
+      </w:r>
+      <w:r>
+        <w:rPr>
+          <w:b/>
+          <w:bCs/>
+          <w:i w:val="0"/>
+          <w:iCs w:val="0"/>
+          <w:sz w:val="24"/>
+          <w:szCs w:val="24"/>
+        </w:rPr>
+        <w:t xml:space="preserve"> – Power Up</w:t>
+      </w:r>
+      <w:bookmarkEnd w:id="28"/>
+    </w:p>
+    <w:p>
+      <w:r>
+        <w:t xml:space="preserve">Figure 10 shows the </w:t>
+      </w:r>
+      <w:proofErr w:type="spellStart"/>
+      <w:r>
+        <w:t>Quarch</w:t>
+      </w:r>
+      <w:proofErr w:type="spellEnd"/>
+      <w:r>
+        <w:t xml:space="preserve"> Power Studio trace of the power sequencing, with non-essential channels hidden, and annotations added in afterwards. The timestamp at which the host power (3V3_Host) in this case is shown by the leftmost annotation. The delays on the power rails are 1 second on 12V, 1.5 seconds on 3V3_AUX, and 2 seconds on 3V3. </w:t>
+      </w:r>
+    </w:p>
+    <w:p>
+      <w:r>
+        <w:t>The device powers on as expected, when all 3 rails are on. However, for this device most of the power is drawn from the 12V rail. The order of power rails going up</w:t>
+      </w:r>
+      <w:r>
+        <w:t>, the length of delay, and the host power rail the breaker is triggered off should be changed between tests, and the device should confirm to operate as expected</w:t>
+      </w:r>
+    </w:p>
+    <w:p>
+      <w:r>
+        <w:t>The host PC is manually powered up and powered down.</w:t>
+      </w:r>
+    </w:p>
+    <w:p>
+      <w:pPr>
+        <w:rPr>
+          <w:b/>
+          <w:bCs/>
+        </w:rPr>
+      </w:pPr>
+      <w:r>
+        <w:rPr>
+          <w:b/>
+          <w:bCs/>
+        </w:rPr>
+        <w:br w:type="page"/>
+      </w:r>
+    </w:p>
+    <w:p>
+      <w:pPr>
+        <w:rPr>
+          <w:b/>
+          <w:bCs/>
+        </w:rPr>
+      </w:pPr>
+    </w:p>
+    <w:p>
+      <w:pPr>
+        <w:pStyle w:val="Caption"/>
+        <w:jc w:val="center"/>
+        <w:rPr>
+          <w:b/>
+          <w:bCs/>
+          <w:i w:val="0"/>
+          <w:iCs w:val="0"/>
+          <w:color w:val="auto"/>
+          <w:sz w:val="24"/>
+          <w:szCs w:val="24"/>
+        </w:rPr>
+      </w:pPr>
     </w:p>
     <w:p>
       <w:pPr>
         <w:pStyle w:val="Heading2"/>
       </w:pPr>
-      <w:bookmarkStart w:id="24" w:name="_Toc184889529"/>
-      <w:bookmarkStart w:id="25" w:name="_Toc191043706"/>
+      <w:bookmarkStart w:id="29" w:name="_Toc184889529"/>
+      <w:bookmarkStart w:id="30" w:name="_Toc219130208"/>
       <w:r>
         <w:t>6.</w:t>
       </w:r>
@@ -4078,21 +5385,21 @@
       <w:r>
         <w:t>Power Applications</w:t>
       </w:r>
-      <w:bookmarkEnd w:id="24"/>
-      <w:bookmarkEnd w:id="25"/>
+      <w:bookmarkEnd w:id="29"/>
+      <w:bookmarkEnd w:id="30"/>
     </w:p>
     <w:p>
       <w:pPr>
         <w:pStyle w:val="Heading3"/>
       </w:pPr>
-      <w:bookmarkStart w:id="26" w:name="_Toc191043707"/>
+      <w:bookmarkStart w:id="31" w:name="_Toc219130209"/>
       <w:r>
         <w:t xml:space="preserve">6.1 </w:t>
       </w:r>
       <w:r>
         <w:t>12V Power Rail Pulled to Ground Upon PERST# Assert</w:t>
       </w:r>
-      <w:bookmarkEnd w:id="26"/>
+      <w:bookmarkEnd w:id="31"/>
     </w:p>
     <w:p>
       <w:pPr>
@@ -4283,7 +5590,7 @@
                     </pic:cNvPicPr>
                   </pic:nvPicPr>
                   <pic:blipFill>
-                    <a:blip r:embed="rId17" cstate="print">
+                    <a:blip r:embed="rId20" cstate="print">
                       <a:extLst>
                         <a:ext uri="{28A0092B-C50C-407E-A947-70E740481C1C}">
                           <a14:useLocalDpi xmlns:a14="http://schemas.microsoft.com/office/drawing/2010/main" val="0"/>
@@ -4327,7 +5634,7 @@
           <w:szCs w:val="24"/>
         </w:rPr>
       </w:pPr>
-      <w:bookmarkStart w:id="27" w:name="_Toc191043691"/>
+      <w:bookmarkStart w:id="32" w:name="_Toc219130226"/>
       <w:r>
         <w:rPr>
           <w:rFonts w:ascii="Arial" w:hAnsi="Arial" w:cs="Arial"/>
@@ -4392,7 +5699,7 @@
           <w:sz w:val="24"/>
           <w:szCs w:val="24"/>
         </w:rPr>
-        <w:t>8</w:t>
+        <w:t>11</w:t>
       </w:r>
       <w:r>
         <w:rPr>
@@ -4420,7 +5727,7 @@
         </w:rPr>
         <w:t>. Setup with U.2 Breaker + Power Injection Fixture</w:t>
       </w:r>
-      <w:bookmarkEnd w:id="27"/>
+      <w:bookmarkEnd w:id="32"/>
     </w:p>
     <w:p>
       <w:pPr>
@@ -4433,7 +5740,7 @@
         </w:rPr>
         <w:lastRenderedPageBreak/>
         <w:drawing>
-          <wp:inline distT="0" distB="0" distL="0" distR="0" wp14:anchorId="2E776021" wp14:editId="21F874D5">
+          <wp:inline distT="0" distB="0" distL="0" distR="0" wp14:anchorId="2E776021" wp14:editId="16BF0FF7">
             <wp:extent cx="3635654" cy="2874440"/>
             <wp:effectExtent l="0" t="0" r="3175" b="2540"/>
             <wp:docPr id="1822876549" name="Picture 23"/>
@@ -4450,7 +5757,7 @@
                     </pic:cNvPicPr>
                   </pic:nvPicPr>
                   <pic:blipFill>
-                    <a:blip r:embed="rId18" cstate="print">
+                    <a:blip r:embed="rId21" cstate="print">
                       <a:extLst>
                         <a:ext uri="{28A0092B-C50C-407E-A947-70E740481C1C}">
                           <a14:useLocalDpi xmlns:a14="http://schemas.microsoft.com/office/drawing/2010/main" val="0"/>
@@ -4494,7 +5801,7 @@
           <w:szCs w:val="24"/>
         </w:rPr>
       </w:pPr>
-      <w:bookmarkStart w:id="28" w:name="_Toc191043692"/>
+      <w:bookmarkStart w:id="33" w:name="_Toc219130227"/>
       <w:r>
         <w:rPr>
           <w:rFonts w:ascii="Arial" w:hAnsi="Arial" w:cs="Arial"/>
@@ -4559,7 +5866,7 @@
           <w:sz w:val="24"/>
           <w:szCs w:val="24"/>
         </w:rPr>
-        <w:t>9</w:t>
+        <w:t>12</w:t>
       </w:r>
       <w:r>
         <w:rPr>
@@ -4587,7 +5894,7 @@
         </w:rPr>
         <w:t>. Flow Chart of a Setup</w:t>
       </w:r>
-      <w:bookmarkEnd w:id="28"/>
+      <w:bookmarkEnd w:id="33"/>
     </w:p>
     <w:p>
       <w:r>
@@ -4676,7 +5983,7 @@
                     </pic:cNvPicPr>
                   </pic:nvPicPr>
                   <pic:blipFill>
-                    <a:blip r:embed="rId19" cstate="print">
+                    <a:blip r:embed="rId22" cstate="print">
                       <a:extLst>
                         <a:ext uri="{28A0092B-C50C-407E-A947-70E740481C1C}">
                           <a14:useLocalDpi xmlns:a14="http://schemas.microsoft.com/office/drawing/2010/main" val="0"/>
@@ -4720,7 +6027,7 @@
           <w:szCs w:val="24"/>
         </w:rPr>
       </w:pPr>
-      <w:bookmarkStart w:id="29" w:name="_Toc191043693"/>
+      <w:bookmarkStart w:id="34" w:name="_Toc219130228"/>
       <w:r>
         <w:rPr>
           <w:rFonts w:ascii="Arial" w:hAnsi="Arial" w:cs="Arial"/>
@@ -4785,7 +6092,7 @@
           <w:sz w:val="24"/>
           <w:szCs w:val="24"/>
         </w:rPr>
-        <w:t>10</w:t>
+        <w:t>13</w:t>
       </w:r>
       <w:r>
         <w:rPr>
@@ -4813,7 +6120,7 @@
         </w:rPr>
         <w:t>. Setup with MCIO to U.2 Breaker + MCIO Host Card</w:t>
       </w:r>
-      <w:bookmarkEnd w:id="29"/>
+      <w:bookmarkEnd w:id="34"/>
     </w:p>
     <w:p>
       <w:pPr>
@@ -4843,7 +6150,7 @@
                     </pic:cNvPicPr>
                   </pic:nvPicPr>
                   <pic:blipFill>
-                    <a:blip r:embed="rId20">
+                    <a:blip r:embed="rId23">
                       <a:extLst>
                         <a:ext uri="{28A0092B-C50C-407E-A947-70E740481C1C}">
                           <a14:useLocalDpi xmlns:a14="http://schemas.microsoft.com/office/drawing/2010/main" val="0"/>
@@ -4887,7 +6194,7 @@
           <w:szCs w:val="24"/>
         </w:rPr>
       </w:pPr>
-      <w:bookmarkStart w:id="30" w:name="_Toc191043694"/>
+      <w:bookmarkStart w:id="35" w:name="_Toc219130229"/>
       <w:r>
         <w:rPr>
           <w:rFonts w:ascii="Arial" w:hAnsi="Arial" w:cs="Arial"/>
@@ -4952,7 +6259,7 @@
           <w:sz w:val="24"/>
           <w:szCs w:val="24"/>
         </w:rPr>
-        <w:t>11</w:t>
+        <w:t>14</w:t>
       </w:r>
       <w:r>
         <w:rPr>
@@ -4980,7 +6287,7 @@
         </w:rPr>
         <w:t>. Flow Chart of Setup</w:t>
       </w:r>
-      <w:bookmarkEnd w:id="30"/>
+      <w:bookmarkEnd w:id="35"/>
     </w:p>
     <w:p>
       <w:pPr>
@@ -5027,17 +6334,33 @@
       </w:r>
       <w:proofErr w:type="gramEnd"/>
       <w:r>
-        <w:t xml:space="preserve"> UP  -- Turn on the power </w:t>
-      </w:r>
-    </w:p>
-    <w:p>
+        <w:t xml:space="preserve"> </w:t>
+      </w:r>
       <w:proofErr w:type="gramStart"/>
       <w:r>
+        <w:t>UP  --</w:t>
+      </w:r>
+      <w:proofErr w:type="gramEnd"/>
+      <w:r>
+        <w:t xml:space="preserve"> Turn on the power </w:t>
+      </w:r>
+    </w:p>
+    <w:p>
+      <w:proofErr w:type="gramStart"/>
+      <w:r>
         <w:t>CONFIG:OUTPUT</w:t>
       </w:r>
       <w:proofErr w:type="gramEnd"/>
       <w:r>
-        <w:t xml:space="preserve">:12V:PULLDOWN ON -- Enables pull down </w:t>
+        <w:t>:12</w:t>
+      </w:r>
+      <w:proofErr w:type="gramStart"/>
+      <w:r>
+        <w:t>V:PULLDOWN</w:t>
+      </w:r>
+      <w:proofErr w:type="gramEnd"/>
+      <w:r>
+        <w:t xml:space="preserve"> ON -- Enables pull down </w:t>
       </w:r>
     </w:p>
     <w:p>
@@ -5070,7 +6393,15 @@
       </w:r>
       <w:proofErr w:type="gramEnd"/>
       <w:r>
-        <w:t xml:space="preserve">:EXTERNAL:TYPE:EDGE -- Sets trigger in to trigger on an edge </w:t>
+        <w:t>:</w:t>
+      </w:r>
+      <w:proofErr w:type="gramStart"/>
+      <w:r>
+        <w:t>EXTERNAL:TYPE</w:t>
+      </w:r>
+      <w:proofErr w:type="gramEnd"/>
+      <w:r>
+        <w:t xml:space="preserve">:EDGE -- Sets trigger in to trigger on an edge </w:t>
       </w:r>
     </w:p>
     <w:p>
@@ -5113,7 +6444,15 @@
       </w:r>
       <w:proofErr w:type="gramEnd"/>
       <w:r>
-        <w:t>:DRIVE:OPEN LOW -- When PERST is discounted module will drive device side LOW</w:t>
+        <w:t>:</w:t>
+      </w:r>
+      <w:proofErr w:type="gramStart"/>
+      <w:r>
+        <w:t>DRIVE:OPEN</w:t>
+      </w:r>
+      <w:proofErr w:type="gramEnd"/>
+      <w:r>
+        <w:t xml:space="preserve"> LOW -- When PERST is discounted module will drive device side LOW</w:t>
       </w:r>
     </w:p>
     <w:p>
@@ -5187,8 +6526,8 @@
       <w:pPr>
         <w:pStyle w:val="Heading3"/>
       </w:pPr>
-      <w:bookmarkStart w:id="31" w:name="_Toc184889530"/>
-      <w:bookmarkStart w:id="32" w:name="_Toc191043708"/>
+      <w:bookmarkStart w:id="36" w:name="_Toc184889530"/>
+      <w:bookmarkStart w:id="37" w:name="_Toc219130210"/>
       <w:r>
         <w:lastRenderedPageBreak/>
         <w:t xml:space="preserve">6.2 </w:t>
@@ -5196,8 +6535,8 @@
       <w:r>
         <w:t>Power Delay Upon Power Up</w:t>
       </w:r>
-      <w:bookmarkEnd w:id="31"/>
-      <w:bookmarkEnd w:id="32"/>
+      <w:bookmarkEnd w:id="36"/>
+      <w:bookmarkEnd w:id="37"/>
     </w:p>
     <w:p>
       <w:r>
@@ -5306,7 +6645,7 @@
                     </pic:cNvPicPr>
                   </pic:nvPicPr>
                   <pic:blipFill>
-                    <a:blip r:embed="rId21">
+                    <a:blip r:embed="rId24">
                       <a:extLst>
                         <a:ext uri="{28A0092B-C50C-407E-A947-70E740481C1C}">
                           <a14:useLocalDpi xmlns:a14="http://schemas.microsoft.com/office/drawing/2010/main" val="0"/>
@@ -5350,7 +6689,7 @@
           <w:szCs w:val="24"/>
         </w:rPr>
       </w:pPr>
-      <w:bookmarkStart w:id="33" w:name="_Toc191043695"/>
+      <w:bookmarkStart w:id="38" w:name="_Toc219130230"/>
       <w:r>
         <w:rPr>
           <w:rFonts w:ascii="Arial" w:hAnsi="Arial" w:cs="Arial"/>
@@ -5415,7 +6754,7 @@
           <w:sz w:val="24"/>
           <w:szCs w:val="24"/>
         </w:rPr>
-        <w:t>12</w:t>
+        <w:t>15</w:t>
       </w:r>
       <w:r>
         <w:rPr>
@@ -5443,7 +6782,7 @@
         </w:rPr>
         <w:t>. Power Delay Upon Power Up Flow Chart</w:t>
       </w:r>
-      <w:bookmarkEnd w:id="33"/>
+      <w:bookmarkEnd w:id="38"/>
     </w:p>
     <w:p/>
     <w:p/>
@@ -5457,8 +6796,8 @@
       <w:pPr>
         <w:pStyle w:val="Heading3"/>
       </w:pPr>
-      <w:bookmarkStart w:id="34" w:name="_Toc184889531"/>
-      <w:bookmarkStart w:id="35" w:name="_Toc191043709"/>
+      <w:bookmarkStart w:id="39" w:name="_Toc184889531"/>
+      <w:bookmarkStart w:id="40" w:name="_Toc219130211"/>
       <w:r>
         <w:lastRenderedPageBreak/>
         <w:t xml:space="preserve">6.3 </w:t>
@@ -5466,8 +6805,8 @@
       <w:r>
         <w:t>Triggering on Host Power Up</w:t>
       </w:r>
-      <w:bookmarkEnd w:id="34"/>
-      <w:bookmarkEnd w:id="35"/>
+      <w:bookmarkEnd w:id="39"/>
+      <w:bookmarkEnd w:id="40"/>
     </w:p>
     <w:p>
       <w:pPr>
@@ -5483,9 +6822,9 @@
       </w:r>
     </w:p>
     <w:p>
-      <w:bookmarkStart w:id="36" w:name="_Toc168888063"/>
-      <w:bookmarkStart w:id="37" w:name="_Toc252891756"/>
-      <w:bookmarkStart w:id="38" w:name="_Toc262048572"/>
+      <w:bookmarkStart w:id="41" w:name="_Toc168888063"/>
+      <w:bookmarkStart w:id="42" w:name="_Toc252891756"/>
+      <w:bookmarkStart w:id="43" w:name="_Toc262048572"/>
       <w:r>
         <w:t>Firmware version 4.005 has added the functionality to provide an internal and external trigger on host power up.</w:t>
       </w:r>
@@ -5510,9 +6849,9 @@
       <w:r>
         <w:t>Since the trigger is initiated by the Host powering, a separate PC is used to control the modules.</w:t>
       </w:r>
-      <w:bookmarkEnd w:id="36"/>
-      <w:bookmarkEnd w:id="37"/>
-      <w:bookmarkEnd w:id="38"/>
+      <w:bookmarkEnd w:id="41"/>
+      <w:bookmarkEnd w:id="42"/>
+      <w:bookmarkEnd w:id="43"/>
     </w:p>
     <w:p>
       <w:pPr>
@@ -5737,7 +7076,7 @@
                     </pic:cNvPicPr>
                   </pic:nvPicPr>
                   <pic:blipFill>
-                    <a:blip r:embed="rId22" cstate="print">
+                    <a:blip r:embed="rId25" cstate="print">
                       <a:extLst>
                         <a:ext uri="{28A0092B-C50C-407E-A947-70E740481C1C}">
                           <a14:useLocalDpi xmlns:a14="http://schemas.microsoft.com/office/drawing/2010/main" val="0"/>
@@ -5782,7 +7121,7 @@
           <w:lang w:bidi="en-US"/>
         </w:rPr>
       </w:pPr>
-      <w:bookmarkStart w:id="39" w:name="_Toc191043696"/>
+      <w:bookmarkStart w:id="44" w:name="_Toc219130231"/>
       <w:r>
         <w:rPr>
           <w:rFonts w:ascii="Arial" w:hAnsi="Arial" w:cs="Arial"/>
@@ -5847,7 +7186,7 @@
           <w:sz w:val="24"/>
           <w:szCs w:val="24"/>
         </w:rPr>
-        <w:t>13</w:t>
+        <w:t>16</w:t>
       </w:r>
       <w:r>
         <w:rPr>
@@ -5875,7 +7214,7 @@
         </w:rPr>
         <w:t>. Requirements</w:t>
       </w:r>
-      <w:bookmarkEnd w:id="39"/>
+      <w:bookmarkEnd w:id="44"/>
     </w:p>
     <w:p>
       <w:pPr>
@@ -5917,7 +7256,7 @@
                     </pic:cNvPicPr>
                   </pic:nvPicPr>
                   <pic:blipFill>
-                    <a:blip r:embed="rId23">
+                    <a:blip r:embed="rId26">
                       <a:extLst>
                         <a:ext uri="{28A0092B-C50C-407E-A947-70E740481C1C}">
                           <a14:useLocalDpi xmlns:a14="http://schemas.microsoft.com/office/drawing/2010/main" val="0"/>
@@ -5961,7 +7300,7 @@
           <w:szCs w:val="24"/>
         </w:rPr>
       </w:pPr>
-      <w:bookmarkStart w:id="40" w:name="_Toc191043697"/>
+      <w:bookmarkStart w:id="45" w:name="_Toc219130232"/>
       <w:r>
         <w:rPr>
           <w:rFonts w:ascii="Arial" w:hAnsi="Arial" w:cs="Arial"/>
@@ -6026,7 +7365,7 @@
           <w:sz w:val="24"/>
           <w:szCs w:val="24"/>
         </w:rPr>
-        <w:t>14</w:t>
+        <w:t>17</w:t>
       </w:r>
       <w:r>
         <w:rPr>
@@ -6054,7 +7393,7 @@
         </w:rPr>
         <w:t>. On Host Power Up Flow Chart</w:t>
       </w:r>
-      <w:bookmarkEnd w:id="40"/>
+      <w:bookmarkEnd w:id="45"/>
     </w:p>
     <w:p>
       <w:pPr>
@@ -6084,7 +7423,7 @@
                     </pic:cNvPicPr>
                   </pic:nvPicPr>
                   <pic:blipFill>
-                    <a:blip r:embed="rId24">
+                    <a:blip r:embed="rId27">
                       <a:extLst>
                         <a:ext uri="{28A0092B-C50C-407E-A947-70E740481C1C}">
                           <a14:useLocalDpi xmlns:a14="http://schemas.microsoft.com/office/drawing/2010/main" val="0"/>
@@ -6128,7 +7467,7 @@
           <w:szCs w:val="24"/>
         </w:rPr>
       </w:pPr>
-      <w:bookmarkStart w:id="41" w:name="_Toc191043698"/>
+      <w:bookmarkStart w:id="46" w:name="_Toc219130233"/>
       <w:r>
         <w:rPr>
           <w:rFonts w:ascii="Arial" w:hAnsi="Arial" w:cs="Arial"/>
@@ -6193,7 +7532,7 @@
           <w:sz w:val="24"/>
           <w:szCs w:val="24"/>
         </w:rPr>
-        <w:t>15</w:t>
+        <w:t>18</w:t>
       </w:r>
       <w:r>
         <w:rPr>
@@ -6221,7 +7560,7 @@
         </w:rPr>
         <w:t>. On Host Power up Setup</w:t>
       </w:r>
-      <w:bookmarkEnd w:id="41"/>
+      <w:bookmarkEnd w:id="46"/>
     </w:p>
     <w:p>
       <w:pPr>
@@ -6419,8 +7758,8 @@
       <w:pPr>
         <w:pStyle w:val="Heading1"/>
       </w:pPr>
-      <w:bookmarkStart w:id="42" w:name="_Toc184889532"/>
-      <w:bookmarkStart w:id="43" w:name="_Toc191043710"/>
+      <w:bookmarkStart w:id="47" w:name="_Toc184889532"/>
+      <w:bookmarkStart w:id="48" w:name="_Toc219130212"/>
       <w:r>
         <w:lastRenderedPageBreak/>
         <w:t xml:space="preserve">7. </w:t>
@@ -6431,8 +7770,8 @@
       <w:r>
         <w:t>eneral Trigger Commands</w:t>
       </w:r>
-      <w:bookmarkEnd w:id="42"/>
-      <w:bookmarkEnd w:id="43"/>
+      <w:bookmarkEnd w:id="47"/>
+      <w:bookmarkEnd w:id="48"/>
     </w:p>
     <w:p>
       <w:proofErr w:type="spellStart"/>
@@ -6706,7 +8045,7 @@
       </w:r>
     </w:p>
     <w:sectPr>
-      <w:headerReference w:type="default" r:id="rId25"/>
+      <w:headerReference w:type="default" r:id="rId28"/>
       <w:pgSz w:w="11906" w:h="16838"/>
       <w:pgMar w:top="1440" w:right="1440" w:bottom="1440" w:left="1440" w:header="680" w:footer="283" w:gutter="0"/>
       <w:cols w:space="708"/>
@@ -6760,6 +8099,22 @@
       </w:pPr>
       <w:r>
         <w:continuationSeparator/>
+      </w:r>
+    </w:p>
+  </w:footnote>
+  <w:footnote w:id="1">
+    <w:p>
+      <w:pPr>
+        <w:pStyle w:val="FootnoteText"/>
+      </w:pPr>
+      <w:r>
+        <w:rPr>
+          <w:rStyle w:val="FootnoteReference"/>
+        </w:rPr>
+        <w:footnoteRef/>
+      </w:r>
+      <w:r>
+        <w:t xml:space="preserve"> PCI Express Card Electromechanical Specification, Revision 6.0, October 23, 2024 – PCI SIG</w:t>
       </w:r>
     </w:p>
   </w:footnote>
@@ -6870,6 +8225,119 @@
 <file path=word/numbering.xml><?xml version="1.0" encoding="utf-8"?>
 <w:numbering xmlns:wpc="http://schemas.microsoft.com/office/word/2010/wordprocessingCanvas" xmlns:cx="http://schemas.microsoft.com/office/drawing/2014/chartex" xmlns:cx1="http://schemas.microsoft.com/office/drawing/2015/9/8/chartex" xmlns:cx2="http://schemas.microsoft.com/office/drawing/2015/10/21/chartex" xmlns:cx3="http://schemas.microsoft.com/office/drawing/2016/5/9/chartex" xmlns:cx4="http://schemas.microsoft.com/office/drawing/2016/5/10/chartex" xmlns:cx5="http://schemas.microsoft.com/office/drawing/2016/5/11/chartex" xmlns:cx6="http://schemas.microsoft.com/office/drawing/2016/5/12/chartex" xmlns:cx7="http://schemas.microsoft.com/office/drawing/2016/5/13/chartex" xmlns:cx8="http://schemas.microsoft.com/office/drawing/2016/5/14/chartex" xmlns:mc="http://schemas.openxmlformats.org/markup-compatibility/2006" xmlns:aink="http://schemas.microsoft.com/office/drawing/2016/ink" xmlns:am3d="http://schemas.microsoft.com/office/drawing/2017/model3d" xmlns:o="urn:schemas-microsoft-com:office:office" xmlns:oel="http://schemas.microsoft.com/office/2019/extlst" xmlns:r="http://schemas.openxmlformats.org/officeDocument/2006/relationships" xmlns:m="http://schemas.openxmlformats.org/officeDocument/2006/math" xmlns:v="urn:schemas-microsoft-com:vml" xmlns:wp14="http://schemas.microsoft.com/office/word/2010/wordprocessingDrawing" xmlns:wp="http://schemas.openxmlformats.org/drawingml/2006/wordprocessingDrawing" xmlns:w10="urn:schemas-microsoft-com:office:word" xmlns:w="http://schemas.openxmlformats.org/wordprocessingml/2006/main" xmlns:w14="http://schemas.microsoft.com/office/word/2010/wordml" xmlns:w15="http://schemas.microsoft.com/office/word/2012/wordml" xmlns:w16cex="http://schemas.microsoft.com/office/word/2018/wordml/cex" xmlns:w16cid="http://schemas.microsoft.com/office/word/2016/wordml/cid" xmlns:w16="http://schemas.microsoft.com/office/word/2018/wordml" xmlns:w16du="http://schemas.microsoft.com/office/word/2023/wordml/word16du" xmlns:w16sdtdh="http://schemas.microsoft.com/office/word/2020/wordml/sdtdatahash" xmlns:w16sdtfl="http://schemas.microsoft.com/office/word/2024/wordml/sdtformatlock" xmlns:w16se="http://schemas.microsoft.com/office/word/2015/wordml/symex" xmlns:wpg="http://schemas.microsoft.com/office/word/2010/wordprocessingGroup" xmlns:wpi="http://schemas.microsoft.com/office/word/2010/wordprocessingInk" xmlns:wne="http://schemas.microsoft.com/office/word/2006/wordml" xmlns:wps="http://schemas.microsoft.com/office/word/2010/wordprocessingShape" mc:Ignorable="w14 w15 w16se w16cid w16 w16cex w16sdtdh w16sdtfl w16du wp14">
   <w:abstractNum w:abstractNumId="0" w15:restartNumberingAfterBreak="0">
+    <w:nsid w:val="01084EF9"/>
+    <w:multiLevelType w:val="hybridMultilevel"/>
+    <w:tmpl w:val="BDBEADA6"/>
+    <w:lvl w:ilvl="0" w:tplc="08090001">
+      <w:start w:val="1"/>
+      <w:numFmt w:val="bullet"/>
+      <w:lvlText w:val=""/>
+      <w:lvlJc w:val="left"/>
+      <w:pPr>
+        <w:ind w:left="720" w:hanging="360"/>
+      </w:pPr>
+      <w:rPr>
+        <w:rFonts w:ascii="Symbol" w:hAnsi="Symbol" w:hint="default"/>
+      </w:rPr>
+    </w:lvl>
+    <w:lvl w:ilvl="1" w:tplc="08090003" w:tentative="1">
+      <w:start w:val="1"/>
+      <w:numFmt w:val="bullet"/>
+      <w:lvlText w:val="o"/>
+      <w:lvlJc w:val="left"/>
+      <w:pPr>
+        <w:ind w:left="1440" w:hanging="360"/>
+      </w:pPr>
+      <w:rPr>
+        <w:rFonts w:ascii="Courier New" w:hAnsi="Courier New" w:cs="Courier New" w:hint="default"/>
+      </w:rPr>
+    </w:lvl>
+    <w:lvl w:ilvl="2" w:tplc="08090005" w:tentative="1">
+      <w:start w:val="1"/>
+      <w:numFmt w:val="bullet"/>
+      <w:lvlText w:val=""/>
+      <w:lvlJc w:val="left"/>
+      <w:pPr>
+        <w:ind w:left="2160" w:hanging="360"/>
+      </w:pPr>
+      <w:rPr>
+        <w:rFonts w:ascii="Wingdings" w:hAnsi="Wingdings" w:hint="default"/>
+      </w:rPr>
+    </w:lvl>
+    <w:lvl w:ilvl="3" w:tplc="08090001" w:tentative="1">
+      <w:start w:val="1"/>
+      <w:numFmt w:val="bullet"/>
+      <w:lvlText w:val=""/>
+      <w:lvlJc w:val="left"/>
+      <w:pPr>
+        <w:ind w:left="2880" w:hanging="360"/>
+      </w:pPr>
+      <w:rPr>
+        <w:rFonts w:ascii="Symbol" w:hAnsi="Symbol" w:hint="default"/>
+      </w:rPr>
+    </w:lvl>
+    <w:lvl w:ilvl="4" w:tplc="08090003" w:tentative="1">
+      <w:start w:val="1"/>
+      <w:numFmt w:val="bullet"/>
+      <w:lvlText w:val="o"/>
+      <w:lvlJc w:val="left"/>
+      <w:pPr>
+        <w:ind w:left="3600" w:hanging="360"/>
+      </w:pPr>
+      <w:rPr>
+        <w:rFonts w:ascii="Courier New" w:hAnsi="Courier New" w:cs="Courier New" w:hint="default"/>
+      </w:rPr>
+    </w:lvl>
+    <w:lvl w:ilvl="5" w:tplc="08090005" w:tentative="1">
+      <w:start w:val="1"/>
+      <w:numFmt w:val="bullet"/>
+      <w:lvlText w:val=""/>
+      <w:lvlJc w:val="left"/>
+      <w:pPr>
+        <w:ind w:left="4320" w:hanging="360"/>
+      </w:pPr>
+      <w:rPr>
+        <w:rFonts w:ascii="Wingdings" w:hAnsi="Wingdings" w:hint="default"/>
+      </w:rPr>
+    </w:lvl>
+    <w:lvl w:ilvl="6" w:tplc="08090001" w:tentative="1">
+      <w:start w:val="1"/>
+      <w:numFmt w:val="bullet"/>
+      <w:lvlText w:val=""/>
+      <w:lvlJc w:val="left"/>
+      <w:pPr>
+        <w:ind w:left="5040" w:hanging="360"/>
+      </w:pPr>
+      <w:rPr>
+        <w:rFonts w:ascii="Symbol" w:hAnsi="Symbol" w:hint="default"/>
+      </w:rPr>
+    </w:lvl>
+    <w:lvl w:ilvl="7" w:tplc="08090003" w:tentative="1">
+      <w:start w:val="1"/>
+      <w:numFmt w:val="bullet"/>
+      <w:lvlText w:val="o"/>
+      <w:lvlJc w:val="left"/>
+      <w:pPr>
+        <w:ind w:left="5760" w:hanging="360"/>
+      </w:pPr>
+      <w:rPr>
+        <w:rFonts w:ascii="Courier New" w:hAnsi="Courier New" w:cs="Courier New" w:hint="default"/>
+      </w:rPr>
+    </w:lvl>
+    <w:lvl w:ilvl="8" w:tplc="08090005" w:tentative="1">
+      <w:start w:val="1"/>
+      <w:numFmt w:val="bullet"/>
+      <w:lvlText w:val=""/>
+      <w:lvlJc w:val="left"/>
+      <w:pPr>
+        <w:ind w:left="6480" w:hanging="360"/>
+      </w:pPr>
+      <w:rPr>
+        <w:rFonts w:ascii="Wingdings" w:hAnsi="Wingdings" w:hint="default"/>
+      </w:rPr>
+    </w:lvl>
+  </w:abstractNum>
+  <w:abstractNum w:abstractNumId="1" w15:restartNumberingAfterBreak="0">
     <w:nsid w:val="035921E5"/>
     <w:multiLevelType w:val="hybridMultilevel"/>
     <w:tmpl w:val="27B001F4"/>
@@ -6982,7 +8450,7 @@
       </w:rPr>
     </w:lvl>
   </w:abstractNum>
-  <w:abstractNum w:abstractNumId="1" w15:restartNumberingAfterBreak="0">
+  <w:abstractNum w:abstractNumId="2" w15:restartNumberingAfterBreak="0">
     <w:nsid w:val="26A839EA"/>
     <w:multiLevelType w:val="multilevel"/>
     <w:tmpl w:val="F40AEE26"/>
@@ -7131,7 +8599,7 @@
       </w:rPr>
     </w:lvl>
   </w:abstractNum>
-  <w:abstractNum w:abstractNumId="2" w15:restartNumberingAfterBreak="0">
+  <w:abstractNum w:abstractNumId="3" w15:restartNumberingAfterBreak="0">
     <w:nsid w:val="295A2A62"/>
     <w:multiLevelType w:val="multilevel"/>
     <w:tmpl w:val="4A68F722"/>
@@ -7244,7 +8712,7 @@
       </w:pPr>
     </w:lvl>
   </w:abstractNum>
-  <w:abstractNum w:abstractNumId="3" w15:restartNumberingAfterBreak="0">
+  <w:abstractNum w:abstractNumId="4" w15:restartNumberingAfterBreak="0">
     <w:nsid w:val="2DD44FC0"/>
     <w:multiLevelType w:val="multilevel"/>
     <w:tmpl w:val="A3742A4A"/>
@@ -7393,7 +8861,7 @@
       </w:rPr>
     </w:lvl>
   </w:abstractNum>
-  <w:abstractNum w:abstractNumId="4" w15:restartNumberingAfterBreak="0">
+  <w:abstractNum w:abstractNumId="5" w15:restartNumberingAfterBreak="0">
     <w:nsid w:val="391D5919"/>
     <w:multiLevelType w:val="hybridMultilevel"/>
     <w:tmpl w:val="FB42C0F0"/>
@@ -7482,7 +8950,7 @@
       </w:pPr>
     </w:lvl>
   </w:abstractNum>
-  <w:abstractNum w:abstractNumId="5" w15:restartNumberingAfterBreak="0">
+  <w:abstractNum w:abstractNumId="6" w15:restartNumberingAfterBreak="0">
     <w:nsid w:val="44EA008B"/>
     <w:multiLevelType w:val="hybridMultilevel"/>
     <w:tmpl w:val="A3626DFA"/>
@@ -7571,7 +9039,7 @@
       </w:pPr>
     </w:lvl>
   </w:abstractNum>
-  <w:abstractNum w:abstractNumId="6" w15:restartNumberingAfterBreak="0">
+  <w:abstractNum w:abstractNumId="7" w15:restartNumberingAfterBreak="0">
     <w:nsid w:val="4ED87A16"/>
     <w:multiLevelType w:val="multilevel"/>
     <w:tmpl w:val="E85A49EC"/>
@@ -7720,7 +9188,7 @@
       </w:rPr>
     </w:lvl>
   </w:abstractNum>
-  <w:abstractNum w:abstractNumId="7" w15:restartNumberingAfterBreak="0">
+  <w:abstractNum w:abstractNumId="8" w15:restartNumberingAfterBreak="0">
     <w:nsid w:val="7AB306FB"/>
     <w:multiLevelType w:val="multilevel"/>
     <w:tmpl w:val="4A68F722"/>
@@ -7835,28 +9303,31 @@
     </w:lvl>
   </w:abstractNum>
   <w:num w:numId="1" w16cid:durableId="1340235262">
+    <w:abstractNumId w:val="3"/>
+  </w:num>
+  <w:num w:numId="2" w16cid:durableId="1041399189">
+    <w:abstractNumId w:val="1"/>
+  </w:num>
+  <w:num w:numId="3" w16cid:durableId="1351225612">
+    <w:abstractNumId w:val="4"/>
+  </w:num>
+  <w:num w:numId="4" w16cid:durableId="588541098">
+    <w:abstractNumId w:val="7"/>
+  </w:num>
+  <w:num w:numId="5" w16cid:durableId="1939023009">
     <w:abstractNumId w:val="2"/>
   </w:num>
-  <w:num w:numId="2" w16cid:durableId="1041399189">
-    <w:abstractNumId w:val="0"/>
+  <w:num w:numId="6" w16cid:durableId="1751390996">
+    <w:abstractNumId w:val="5"/>
   </w:num>
-  <w:num w:numId="3" w16cid:durableId="1351225612">
-    <w:abstractNumId w:val="3"/>
-  </w:num>
-  <w:num w:numId="4" w16cid:durableId="588541098">
+  <w:num w:numId="7" w16cid:durableId="1588802798">
     <w:abstractNumId w:val="6"/>
   </w:num>
-  <w:num w:numId="5" w16cid:durableId="1939023009">
-    <w:abstractNumId w:val="1"/>
+  <w:num w:numId="8" w16cid:durableId="79523373">
+    <w:abstractNumId w:val="8"/>
   </w:num>
-  <w:num w:numId="6" w16cid:durableId="1751390996">
-    <w:abstractNumId w:val="4"/>
-  </w:num>
-  <w:num w:numId="7" w16cid:durableId="1588802798">
-    <w:abstractNumId w:val="5"/>
-  </w:num>
-  <w:num w:numId="8" w16cid:durableId="79523373">
-    <w:abstractNumId w:val="7"/>
+  <w:num w:numId="9" w16cid:durableId="1922986972">
+    <w:abstractNumId w:val="0"/>
   </w:num>
 </w:numbering>
 </file>
@@ -8462,7 +9933,6 @@
   <w:style w:type="character" w:default="1" w:styleId="DefaultParagraphFont">
     <w:name w:val="Default Paragraph Font"/>
     <w:uiPriority w:val="1"/>
-    <w:semiHidden/>
     <w:unhideWhenUsed/>
   </w:style>
   <w:style w:type="table" w:default="1" w:styleId="TableNormal">

</xml_diff>